<commit_message>
Bericht  für Termin 1 hinzugefügt
Leitungslängen l1 bis l8 ermittelt
</commit_message>
<xml_diff>
--- a/Bericht_Praktikum_mESY4-2_Baer_Hampl.docx
+++ b/Bericht_Praktikum_mESY4-2_Baer_Hampl.docx
@@ -23,13 +23,7 @@
         <w:t xml:space="preserve"> </w:t>
       </w:r>
       <w:r>
-        <w:t xml:space="preserve">Hochfrequenz-Schaltungstechnik </w:t>
-      </w:r>
-      <w:r>
-        <w:t>m</w:t>
-      </w:r>
-      <w:r>
-        <w:t>ESY4/2</w:t>
+        <w:t>Hochfrequenz-Schaltungstechnik mESY4/2</w:t>
       </w:r>
     </w:p>
     <w:p/>
@@ -61,17 +55,3204 @@
         </w:rPr>
         <w:br w:type="page"/>
       </w:r>
-    </w:p>
-    <w:p>
-      <w:pPr>
+      <w:r>
         <w:rPr>
           <w:rFonts w:eastAsiaTheme="minorEastAsia"/>
         </w:rPr>
-      </w:pPr>
+        <w:lastRenderedPageBreak/>
+        <w:br w:type="page"/>
+      </w:r>
+    </w:p>
+    <w:p>
+      <w:pPr>
+        <w:pStyle w:val="berschrift1"/>
+        <w:rPr>
+          <w:rFonts w:eastAsiaTheme="minorEastAsia"/>
+        </w:rPr>
+      </w:pPr>
+      <w:r>
+        <w:rPr>
+          <w:rFonts w:eastAsiaTheme="minorEastAsia"/>
+        </w:rPr>
+        <w:lastRenderedPageBreak/>
+        <w:t>Termin 1</w:t>
+      </w:r>
+    </w:p>
+    <w:p>
+      <w:pPr>
+        <w:pStyle w:val="berschrift2"/>
+        <w:rPr>
+          <w:rFonts w:eastAsiaTheme="minorEastAsia"/>
+        </w:rPr>
+      </w:pPr>
+      <w:r>
+        <w:rPr>
+          <w:rFonts w:eastAsiaTheme="minorEastAsia"/>
+        </w:rPr>
+        <w:t>Bestimmung der Leitungslängen</w:t>
+      </w:r>
+    </w:p>
+    <w:p>
+      <w:r>
+        <w:t xml:space="preserve">Folgende Längen sollen bestimmt </w:t>
+      </w:r>
+      <w:r>
+        <w:t>werden, um bei 1,575 GHz an 50 Ω angepasst zu sein</w:t>
+      </w:r>
+      <w:r>
+        <w:t>:</w:t>
+      </w:r>
+    </w:p>
+    <w:p>
+      <w:r>
+        <w:t>Variante 1: leerlaufende Stichleitung</w:t>
+      </w:r>
+    </w:p>
+    <w:p>
+      <w:r>
+        <w:drawing>
+          <wp:inline distT="0" distB="0" distL="0" distR="0" wp14:anchorId="336ED793" wp14:editId="334E7A10">
+            <wp:extent cx="3436537" cy="1079600"/>
+            <wp:effectExtent l="0" t="0" r="0" b="6350"/>
+            <wp:docPr id="1975489161" name="Grafik 1"/>
+            <wp:cNvGraphicFramePr>
+              <a:graphicFrameLocks xmlns:a="http://schemas.openxmlformats.org/drawingml/2006/main" noChangeAspect="1"/>
+            </wp:cNvGraphicFramePr>
+            <a:graphic xmlns:a="http://schemas.openxmlformats.org/drawingml/2006/main">
+              <a:graphicData uri="http://schemas.openxmlformats.org/drawingml/2006/picture">
+                <pic:pic xmlns:pic="http://schemas.openxmlformats.org/drawingml/2006/picture">
+                  <pic:nvPicPr>
+                    <pic:cNvPr id="1975489161" name=""/>
+                    <pic:cNvPicPr/>
+                  </pic:nvPicPr>
+                  <pic:blipFill>
+                    <a:blip r:embed="rId8"/>
+                    <a:stretch>
+                      <a:fillRect/>
+                    </a:stretch>
+                  </pic:blipFill>
+                  <pic:spPr>
+                    <a:xfrm>
+                      <a:off x="0" y="0"/>
+                      <a:ext cx="3456114" cy="1085750"/>
+                    </a:xfrm>
+                    <a:prstGeom prst="rect">
+                      <a:avLst/>
+                    </a:prstGeom>
+                  </pic:spPr>
+                </pic:pic>
+              </a:graphicData>
+            </a:graphic>
+          </wp:inline>
+        </w:drawing>
+      </w:r>
+    </w:p>
+    <w:p>
+      <w:r>
+        <w:t>Variante 2: kurzgeschlossene Stichleitung</w:t>
+      </w:r>
+    </w:p>
+    <w:p>
+      <w:r>
+        <w:drawing>
+          <wp:inline distT="0" distB="0" distL="0" distR="0" wp14:anchorId="0D3D6B8B" wp14:editId="16D87AAE">
+            <wp:extent cx="3391319" cy="1236231"/>
+            <wp:effectExtent l="0" t="0" r="0" b="2540"/>
+            <wp:docPr id="1460074048" name="Grafik 1"/>
+            <wp:cNvGraphicFramePr>
+              <a:graphicFrameLocks xmlns:a="http://schemas.openxmlformats.org/drawingml/2006/main" noChangeAspect="1"/>
+            </wp:cNvGraphicFramePr>
+            <a:graphic xmlns:a="http://schemas.openxmlformats.org/drawingml/2006/main">
+              <a:graphicData uri="http://schemas.openxmlformats.org/drawingml/2006/picture">
+                <pic:pic xmlns:pic="http://schemas.openxmlformats.org/drawingml/2006/picture">
+                  <pic:nvPicPr>
+                    <pic:cNvPr id="1460074048" name=""/>
+                    <pic:cNvPicPr/>
+                  </pic:nvPicPr>
+                  <pic:blipFill>
+                    <a:blip r:embed="rId9"/>
+                    <a:stretch>
+                      <a:fillRect/>
+                    </a:stretch>
+                  </pic:blipFill>
+                  <pic:spPr>
+                    <a:xfrm>
+                      <a:off x="0" y="0"/>
+                      <a:ext cx="3416428" cy="1245384"/>
+                    </a:xfrm>
+                    <a:prstGeom prst="rect">
+                      <a:avLst/>
+                    </a:prstGeom>
+                  </pic:spPr>
+                </pic:pic>
+              </a:graphicData>
+            </a:graphic>
+          </wp:inline>
+        </w:drawing>
+      </w:r>
+    </w:p>
+    <w:p>
+      <w:pPr>
+        <w:pStyle w:val="berschrift3"/>
+      </w:pPr>
+      <w:r>
+        <w:t>Grafische Ermittlung von</w:t>
+      </w:r>
+      <w:r>
+        <w:t xml:space="preserve"> </w:t>
+      </w:r>
+      <m:oMath>
+        <m:sSub>
+          <m:sSubPr>
+            <m:ctrlPr>
+              <w:rPr>
+                <w:rFonts w:ascii="Cambria Math" w:hAnsi="Cambria Math"/>
+                <w:i/>
+              </w:rPr>
+            </m:ctrlPr>
+          </m:sSubPr>
+          <m:e>
+            <m:r>
+              <w:rPr>
+                <w:rFonts w:ascii="Cambria Math" w:hAnsi="Cambria Math"/>
+              </w:rPr>
+              <m:t>ε</m:t>
+            </m:r>
+          </m:e>
+          <m:sub>
+            <m:r>
+              <w:rPr>
+                <w:rFonts w:ascii="Cambria Math" w:hAnsi="Cambria Math"/>
+              </w:rPr>
+              <m:t>r,eff</m:t>
+            </m:r>
+          </m:sub>
+        </m:sSub>
+      </m:oMath>
+    </w:p>
+    <w:p>
+      <w:pPr>
+        <w:rPr>
+          <w:rFonts w:eastAsiaTheme="minorEastAsia"/>
+        </w:rPr>
+      </w:pPr>
+      <w:r>
+        <w:t xml:space="preserve">Gegeben ist ein </w:t>
+      </w:r>
+      <m:oMath>
+        <m:sSub>
+          <m:sSubPr>
+            <m:ctrlPr>
+              <w:rPr>
+                <w:rFonts w:ascii="Cambria Math" w:hAnsi="Cambria Math"/>
+                <w:i/>
+              </w:rPr>
+            </m:ctrlPr>
+          </m:sSubPr>
+          <m:e>
+            <m:r>
+              <w:rPr>
+                <w:rFonts w:ascii="Cambria Math" w:hAnsi="Cambria Math"/>
+              </w:rPr>
+              <m:t>ε</m:t>
+            </m:r>
+          </m:e>
+          <m:sub>
+            <m:r>
+              <w:rPr>
+                <w:rFonts w:ascii="Cambria Math" w:hAnsi="Cambria Math"/>
+              </w:rPr>
+              <m:t>r</m:t>
+            </m:r>
+          </m:sub>
+        </m:sSub>
+      </m:oMath>
+      <w:r>
+        <w:rPr>
+          <w:rFonts w:eastAsiaTheme="minorEastAsia"/>
+        </w:rPr>
+        <w:t xml:space="preserve"> von 4,7.</w:t>
+      </w:r>
+    </w:p>
+    <w:p>
+      <w:r>
+        <w:rPr>
+          <w:rFonts w:eastAsiaTheme="minorEastAsia"/>
+        </w:rPr>
+        <w:t>Bei einem Leitungswellenwiderstand von 50Ω erreicht wird schätzungsweise das Verhältnis w/h ermittelt.</w:t>
+      </w:r>
+    </w:p>
+    <w:p>
+      <w:r>
+        <w:rPr>
+          <w:noProof/>
+        </w:rPr>
+        <mc:AlternateContent>
+          <mc:Choice Requires="wps">
+            <w:drawing>
+              <wp:anchor distT="0" distB="0" distL="114300" distR="114300" simplePos="0" relativeHeight="251661312" behindDoc="0" locked="0" layoutInCell="1" allowOverlap="1" wp14:anchorId="7A1008BA" wp14:editId="79CA7476">
+                <wp:simplePos x="0" y="0"/>
+                <wp:positionH relativeFrom="column">
+                  <wp:posOffset>250190</wp:posOffset>
+                </wp:positionH>
+                <wp:positionV relativeFrom="paragraph">
+                  <wp:posOffset>761365</wp:posOffset>
+                </wp:positionV>
+                <wp:extent cx="5171440" cy="1136650"/>
+                <wp:effectExtent l="0" t="0" r="10160" b="25400"/>
+                <wp:wrapNone/>
+                <wp:docPr id="1474318020" name="Freihandform: Form 5"/>
+                <wp:cNvGraphicFramePr/>
+                <a:graphic xmlns:a="http://schemas.openxmlformats.org/drawingml/2006/main">
+                  <a:graphicData uri="http://schemas.microsoft.com/office/word/2010/wordprocessingShape">
+                    <wps:wsp>
+                      <wps:cNvSpPr/>
+                      <wps:spPr>
+                        <a:xfrm>
+                          <a:off x="0" y="0"/>
+                          <a:ext cx="5171440" cy="1136650"/>
+                        </a:xfrm>
+                        <a:custGeom>
+                          <a:avLst/>
+                          <a:gdLst>
+                            <a:gd name="csX0" fmla="*/ 0 w 5171945"/>
+                            <a:gd name="csY0" fmla="*/ 0 h 1137828"/>
+                            <a:gd name="csX1" fmla="*/ 3235569 w 5171945"/>
+                            <a:gd name="csY1" fmla="*/ 831649 h 1137828"/>
+                            <a:gd name="csX2" fmla="*/ 5171945 w 5171945"/>
+                            <a:gd name="csY2" fmla="*/ 1137828 h 1137828"/>
+                          </a:gdLst>
+                          <a:ahLst/>
+                          <a:cxnLst>
+                            <a:cxn ang="0">
+                              <a:pos x="csX0" y="csY0"/>
+                            </a:cxn>
+                            <a:cxn ang="0">
+                              <a:pos x="csX1" y="csY1"/>
+                            </a:cxn>
+                            <a:cxn ang="0">
+                              <a:pos x="csX2" y="csY2"/>
+                            </a:cxn>
+                          </a:cxnLst>
+                          <a:rect l="l" t="t" r="r" b="b"/>
+                          <a:pathLst>
+                            <a:path w="5171945" h="1137828">
+                              <a:moveTo>
+                                <a:pt x="0" y="0"/>
+                              </a:moveTo>
+                              <a:cubicBezTo>
+                                <a:pt x="1186789" y="321005"/>
+                                <a:pt x="2373578" y="642011"/>
+                                <a:pt x="3235569" y="831649"/>
+                              </a:cubicBezTo>
+                              <a:cubicBezTo>
+                                <a:pt x="4097560" y="1021287"/>
+                                <a:pt x="4866455" y="1088177"/>
+                                <a:pt x="5171945" y="1137828"/>
+                              </a:cubicBezTo>
+                            </a:path>
+                          </a:pathLst>
+                        </a:custGeom>
+                        <a:noFill/>
+                        <a:ln w="12700">
+                          <a:solidFill>
+                            <a:schemeClr val="accent2">
+                              <a:lumMod val="60000"/>
+                              <a:lumOff val="40000"/>
+                            </a:schemeClr>
+                          </a:solidFill>
+                        </a:ln>
+                      </wps:spPr>
+                      <wps:style>
+                        <a:lnRef idx="2">
+                          <a:schemeClr val="accent1">
+                            <a:shade val="15000"/>
+                          </a:schemeClr>
+                        </a:lnRef>
+                        <a:fillRef idx="1">
+                          <a:schemeClr val="accent1"/>
+                        </a:fillRef>
+                        <a:effectRef idx="0">
+                          <a:schemeClr val="accent1"/>
+                        </a:effectRef>
+                        <a:fontRef idx="minor">
+                          <a:schemeClr val="lt1"/>
+                        </a:fontRef>
+                      </wps:style>
+                      <wps:bodyPr rot="0" spcFirstLastPara="0" vertOverflow="overflow" horzOverflow="overflow" vert="horz" wrap="square" lIns="91440" tIns="45720" rIns="91440" bIns="45720" numCol="1" spcCol="0" rtlCol="0" fromWordArt="0" anchor="ctr" anchorCtr="0" forceAA="0" compatLnSpc="1">
+                        <a:prstTxWarp prst="textNoShape">
+                          <a:avLst/>
+                        </a:prstTxWarp>
+                        <a:noAutofit/>
+                      </wps:bodyPr>
+                    </wps:wsp>
+                  </a:graphicData>
+                </a:graphic>
+                <wp14:sizeRelV relativeFrom="margin">
+                  <wp14:pctHeight>0</wp14:pctHeight>
+                </wp14:sizeRelV>
+              </wp:anchor>
+            </w:drawing>
+          </mc:Choice>
+          <mc:Fallback>
+            <w:pict>
+              <v:shape w14:anchorId="6E9CDFB8" id="Freihandform: Form 5" o:spid="_x0000_s1026" style="position:absolute;margin-left:19.7pt;margin-top:59.95pt;width:407.2pt;height:89.5pt;z-index:251661312;visibility:visible;mso-wrap-style:square;mso-height-percent:0;mso-wrap-distance-left:9pt;mso-wrap-distance-top:0;mso-wrap-distance-right:9pt;mso-wrap-distance-bottom:0;mso-position-horizontal:absolute;mso-position-horizontal-relative:text;mso-position-vertical:absolute;mso-position-vertical-relative:text;mso-height-percent:0;mso-height-relative:margin;v-text-anchor:middle" coordsize="5171945,1137828" o:gfxdata="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" path="m,c1186789,321005,2373578,642011,3235569,831649v861991,189638,1630886,256528,1936376,306179e" filled="f" strokecolor="#f1a983 [1941]" strokeweight="1pt">
+                <v:stroke joinstyle="miter"/>
+                <v:path arrowok="t" o:connecttype="custom" o:connectlocs="0,0;3235253,830788;5171440,1136650" o:connectangles="0,0,0"/>
+              </v:shape>
+            </w:pict>
+          </mc:Fallback>
+        </mc:AlternateContent>
+      </w:r>
+      <w:r>
+        <w:rPr>
+          <w:noProof/>
+        </w:rPr>
+        <mc:AlternateContent>
+          <mc:Choice Requires="wps">
+            <w:drawing>
+              <wp:anchor distT="0" distB="0" distL="114300" distR="114300" simplePos="0" relativeHeight="251671552" behindDoc="0" locked="0" layoutInCell="1" allowOverlap="1" wp14:anchorId="509FE5E3" wp14:editId="547E3F23">
+                <wp:simplePos x="0" y="0"/>
+                <wp:positionH relativeFrom="column">
+                  <wp:posOffset>3266460</wp:posOffset>
+                </wp:positionH>
+                <wp:positionV relativeFrom="paragraph">
+                  <wp:posOffset>2064385</wp:posOffset>
+                </wp:positionV>
+                <wp:extent cx="419135" cy="227566"/>
+                <wp:effectExtent l="0" t="0" r="0" b="1270"/>
+                <wp:wrapNone/>
+                <wp:docPr id="1253246080" name="Textfeld 2"/>
+                <wp:cNvGraphicFramePr/>
+                <a:graphic xmlns:a="http://schemas.openxmlformats.org/drawingml/2006/main">
+                  <a:graphicData uri="http://schemas.microsoft.com/office/word/2010/wordprocessingShape">
+                    <wps:wsp>
+                      <wps:cNvSpPr txBox="1"/>
+                      <wps:spPr>
+                        <a:xfrm>
+                          <a:off x="0" y="0"/>
+                          <a:ext cx="419135" cy="227566"/>
+                        </a:xfrm>
+                        <a:prstGeom prst="rect">
+                          <a:avLst/>
+                        </a:prstGeom>
+                        <a:noFill/>
+                        <a:ln w="6350">
+                          <a:noFill/>
+                        </a:ln>
+                      </wps:spPr>
+                      <wps:txbx>
+                        <w:txbxContent>
+                          <w:p>
+                            <w:pPr>
+                              <w:rPr>
+                                <w:color w:val="000000" w:themeColor="text1"/>
+                                <w:sz w:val="18"/>
+                                <w:szCs w:val="18"/>
+                                <w:vertAlign w:val="superscript"/>
+                              </w:rPr>
+                            </w:pPr>
+                            <w:r>
+                              <w:rPr>
+                                <w:color w:val="000000" w:themeColor="text1"/>
+                                <w:sz w:val="18"/>
+                                <w:szCs w:val="18"/>
+                              </w:rPr>
+                              <w:t>w/h</w:t>
+                            </w:r>
+                            <w:r>
+                              <w:rPr>
+                                <w:color w:val="000000" w:themeColor="text1"/>
+                                <w:sz w:val="18"/>
+                                <w:szCs w:val="18"/>
+                                <w:vertAlign w:val="superscript"/>
+                              </w:rPr>
+                              <w:t>*</w:t>
+                            </w:r>
+                          </w:p>
+                        </w:txbxContent>
+                      </wps:txbx>
+                      <wps:bodyPr rot="0" spcFirstLastPara="0" vertOverflow="overflow" horzOverflow="overflow" vert="horz" wrap="square" lIns="91440" tIns="45720" rIns="91440" bIns="45720" numCol="1" spcCol="0" rtlCol="0" fromWordArt="0" anchor="t" anchorCtr="0" forceAA="0" compatLnSpc="1">
+                        <a:prstTxWarp prst="textNoShape">
+                          <a:avLst/>
+                        </a:prstTxWarp>
+                        <a:noAutofit/>
+                      </wps:bodyPr>
+                    </wps:wsp>
+                  </a:graphicData>
+                </a:graphic>
+                <wp14:sizeRelH relativeFrom="margin">
+                  <wp14:pctWidth>0</wp14:pctWidth>
+                </wp14:sizeRelH>
+                <wp14:sizeRelV relativeFrom="margin">
+                  <wp14:pctHeight>0</wp14:pctHeight>
+                </wp14:sizeRelV>
+              </wp:anchor>
+            </w:drawing>
+          </mc:Choice>
+          <mc:Fallback>
+            <w:pict>
+              <v:shapetype w14:anchorId="509FE5E3" id="_x0000_t202" coordsize="21600,21600" o:spt="202" path="m,l,21600r21600,l21600,xe">
+                <v:stroke joinstyle="miter"/>
+                <v:path gradientshapeok="t" o:connecttype="rect"/>
+              </v:shapetype>
+              <v:shape id="Textfeld 2" o:spid="_x0000_s1026" type="#_x0000_t202" style="position:absolute;margin-left:257.2pt;margin-top:162.55pt;width:33pt;height:17.9pt;z-index:251671552;visibility:visible;mso-wrap-style:square;mso-width-percent:0;mso-height-percent:0;mso-wrap-distance-left:9pt;mso-wrap-distance-top:0;mso-wrap-distance-right:9pt;mso-wrap-distance-bottom:0;mso-position-horizontal:absolute;mso-position-horizontal-relative:text;mso-position-vertical:absolute;mso-position-vertical-relative:text;mso-width-percent:0;mso-height-percent:0;mso-width-relative:margin;mso-height-relative:margin;v-text-anchor:top" o:gfxdata="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" filled="f" stroked="f" strokeweight=".5pt">
+                <v:textbox>
+                  <w:txbxContent>
+                    <w:p>
+                      <w:pPr>
+                        <w:rPr>
+                          <w:color w:val="000000" w:themeColor="text1"/>
+                          <w:sz w:val="18"/>
+                          <w:szCs w:val="18"/>
+                          <w:vertAlign w:val="superscript"/>
+                        </w:rPr>
+                      </w:pPr>
+                      <w:r>
+                        <w:rPr>
+                          <w:color w:val="000000" w:themeColor="text1"/>
+                          <w:sz w:val="18"/>
+                          <w:szCs w:val="18"/>
+                        </w:rPr>
+                        <w:t>w/h</w:t>
+                      </w:r>
+                      <w:r>
+                        <w:rPr>
+                          <w:color w:val="000000" w:themeColor="text1"/>
+                          <w:sz w:val="18"/>
+                          <w:szCs w:val="18"/>
+                          <w:vertAlign w:val="superscript"/>
+                        </w:rPr>
+                        <w:t>*</w:t>
+                      </w:r>
+                    </w:p>
+                  </w:txbxContent>
+                </v:textbox>
+              </v:shape>
+            </w:pict>
+          </mc:Fallback>
+        </mc:AlternateContent>
+      </w:r>
+      <w:r>
+        <w:rPr>
+          <w:noProof/>
+        </w:rPr>
+        <mc:AlternateContent>
+          <mc:Choice Requires="wps">
+            <w:drawing>
+              <wp:anchor distT="0" distB="0" distL="114300" distR="114300" simplePos="0" relativeHeight="251664384" behindDoc="0" locked="0" layoutInCell="1" allowOverlap="1" wp14:anchorId="1D68ED73" wp14:editId="611B925A">
+                <wp:simplePos x="0" y="0"/>
+                <wp:positionH relativeFrom="column">
+                  <wp:posOffset>3473737</wp:posOffset>
+                </wp:positionH>
+                <wp:positionV relativeFrom="paragraph">
+                  <wp:posOffset>1589405</wp:posOffset>
+                </wp:positionV>
+                <wp:extent cx="0" cy="513080"/>
+                <wp:effectExtent l="0" t="0" r="38100" b="20320"/>
+                <wp:wrapNone/>
+                <wp:docPr id="1851066489" name="Gerader Verbinder 6"/>
+                <wp:cNvGraphicFramePr/>
+                <a:graphic xmlns:a="http://schemas.openxmlformats.org/drawingml/2006/main">
+                  <a:graphicData uri="http://schemas.microsoft.com/office/word/2010/wordprocessingShape">
+                    <wps:wsp>
+                      <wps:cNvCnPr/>
+                      <wps:spPr>
+                        <a:xfrm>
+                          <a:off x="0" y="0"/>
+                          <a:ext cx="0" cy="513080"/>
+                        </a:xfrm>
+                        <a:prstGeom prst="line">
+                          <a:avLst/>
+                        </a:prstGeom>
+                        <a:ln w="12700">
+                          <a:solidFill>
+                            <a:schemeClr val="tx1"/>
+                          </a:solidFill>
+                        </a:ln>
+                      </wps:spPr>
+                      <wps:style>
+                        <a:lnRef idx="2">
+                          <a:schemeClr val="accent1"/>
+                        </a:lnRef>
+                        <a:fillRef idx="0">
+                          <a:schemeClr val="accent1"/>
+                        </a:fillRef>
+                        <a:effectRef idx="1">
+                          <a:schemeClr val="accent1"/>
+                        </a:effectRef>
+                        <a:fontRef idx="minor">
+                          <a:schemeClr val="tx1"/>
+                        </a:fontRef>
+                      </wps:style>
+                      <wps:bodyPr/>
+                    </wps:wsp>
+                  </a:graphicData>
+                </a:graphic>
+                <wp14:sizeRelV relativeFrom="margin">
+                  <wp14:pctHeight>0</wp14:pctHeight>
+                </wp14:sizeRelV>
+              </wp:anchor>
+            </w:drawing>
+          </mc:Choice>
+          <mc:Fallback>
+            <w:pict>
+              <v:line w14:anchorId="3CAB6E1F" id="Gerader Verbinder 6" o:spid="_x0000_s1026" style="position:absolute;z-index:251664384;visibility:visible;mso-wrap-style:square;mso-height-percent:0;mso-wrap-distance-left:9pt;mso-wrap-distance-top:0;mso-wrap-distance-right:9pt;mso-wrap-distance-bottom:0;mso-position-horizontal:absolute;mso-position-horizontal-relative:text;mso-position-vertical:absolute;mso-position-vertical-relative:text;mso-height-percent:0;mso-height-relative:margin" from="273.5pt,125.15pt" to="273.5pt,165.55pt" o:gfxdata="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" strokecolor="black [3213]" strokeweight="1pt">
+                <v:stroke joinstyle="miter"/>
+              </v:line>
+            </w:pict>
+          </mc:Fallback>
+        </mc:AlternateContent>
+      </w:r>
+      <w:r>
+        <w:rPr>
+          <w:noProof/>
+        </w:rPr>
+        <mc:AlternateContent>
+          <mc:Choice Requires="wps">
+            <w:drawing>
+              <wp:anchor distT="0" distB="0" distL="114300" distR="114300" simplePos="0" relativeHeight="251663360" behindDoc="0" locked="0" layoutInCell="1" allowOverlap="1" wp14:anchorId="7660E889" wp14:editId="21A23BDB">
+                <wp:simplePos x="0" y="0"/>
+                <wp:positionH relativeFrom="column">
+                  <wp:posOffset>-81280</wp:posOffset>
+                </wp:positionH>
+                <wp:positionV relativeFrom="paragraph">
+                  <wp:posOffset>617527</wp:posOffset>
+                </wp:positionV>
+                <wp:extent cx="419135" cy="227566"/>
+                <wp:effectExtent l="0" t="0" r="0" b="1270"/>
+                <wp:wrapNone/>
+                <wp:docPr id="175174538" name="Textfeld 2"/>
+                <wp:cNvGraphicFramePr/>
+                <a:graphic xmlns:a="http://schemas.openxmlformats.org/drawingml/2006/main">
+                  <a:graphicData uri="http://schemas.microsoft.com/office/word/2010/wordprocessingShape">
+                    <wps:wsp>
+                      <wps:cNvSpPr txBox="1"/>
+                      <wps:spPr>
+                        <a:xfrm>
+                          <a:off x="0" y="0"/>
+                          <a:ext cx="419135" cy="227566"/>
+                        </a:xfrm>
+                        <a:prstGeom prst="rect">
+                          <a:avLst/>
+                        </a:prstGeom>
+                        <a:noFill/>
+                        <a:ln w="6350">
+                          <a:noFill/>
+                        </a:ln>
+                      </wps:spPr>
+                      <wps:txbx>
+                        <w:txbxContent>
+                          <w:p>
+                            <w:pPr>
+                              <w:rPr>
+                                <w:color w:val="F1A983" w:themeColor="accent2" w:themeTint="99"/>
+                                <w:sz w:val="18"/>
+                                <w:szCs w:val="18"/>
+                              </w:rPr>
+                            </w:pPr>
+                            <w:r>
+                              <w:rPr>
+                                <w:color w:val="F1A983" w:themeColor="accent2" w:themeTint="99"/>
+                                <w:sz w:val="18"/>
+                                <w:szCs w:val="18"/>
+                              </w:rPr>
+                              <w:t>≈4,7</w:t>
+                            </w:r>
+                          </w:p>
+                        </w:txbxContent>
+                      </wps:txbx>
+                      <wps:bodyPr rot="0" spcFirstLastPara="0" vertOverflow="overflow" horzOverflow="overflow" vert="horz" wrap="square" lIns="91440" tIns="45720" rIns="91440" bIns="45720" numCol="1" spcCol="0" rtlCol="0" fromWordArt="0" anchor="t" anchorCtr="0" forceAA="0" compatLnSpc="1">
+                        <a:prstTxWarp prst="textNoShape">
+                          <a:avLst/>
+                        </a:prstTxWarp>
+                        <a:noAutofit/>
+                      </wps:bodyPr>
+                    </wps:wsp>
+                  </a:graphicData>
+                </a:graphic>
+                <wp14:sizeRelH relativeFrom="margin">
+                  <wp14:pctWidth>0</wp14:pctWidth>
+                </wp14:sizeRelH>
+                <wp14:sizeRelV relativeFrom="margin">
+                  <wp14:pctHeight>0</wp14:pctHeight>
+                </wp14:sizeRelV>
+              </wp:anchor>
+            </w:drawing>
+          </mc:Choice>
+          <mc:Fallback>
+            <w:pict>
+              <v:shape w14:anchorId="7660E889" id="_x0000_s1027" type="#_x0000_t202" style="position:absolute;margin-left:-6.4pt;margin-top:48.6pt;width:33pt;height:17.9pt;z-index:251663360;visibility:visible;mso-wrap-style:square;mso-width-percent:0;mso-height-percent:0;mso-wrap-distance-left:9pt;mso-wrap-distance-top:0;mso-wrap-distance-right:9pt;mso-wrap-distance-bottom:0;mso-position-horizontal:absolute;mso-position-horizontal-relative:text;mso-position-vertical:absolute;mso-position-vertical-relative:text;mso-width-percent:0;mso-height-percent:0;mso-width-relative:margin;mso-height-relative:margin;v-text-anchor:top" o:gfxdata="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" filled="f" stroked="f" strokeweight=".5pt">
+                <v:textbox>
+                  <w:txbxContent>
+                    <w:p>
+                      <w:pPr>
+                        <w:rPr>
+                          <w:color w:val="F1A983" w:themeColor="accent2" w:themeTint="99"/>
+                          <w:sz w:val="18"/>
+                          <w:szCs w:val="18"/>
+                        </w:rPr>
+                      </w:pPr>
+                      <w:r>
+                        <w:rPr>
+                          <w:color w:val="F1A983" w:themeColor="accent2" w:themeTint="99"/>
+                          <w:sz w:val="18"/>
+                          <w:szCs w:val="18"/>
+                        </w:rPr>
+                        <w:t>≈4,7</w:t>
+                      </w:r>
+                    </w:p>
+                  </w:txbxContent>
+                </v:textbox>
+              </v:shape>
+            </w:pict>
+          </mc:Fallback>
+        </mc:AlternateContent>
+      </w:r>
+      <w:r>
+        <w:rPr>
+          <w:noProof/>
+        </w:rPr>
+        <mc:AlternateContent>
+          <mc:Choice Requires="wps">
+            <w:drawing>
+              <wp:anchor distT="0" distB="0" distL="114300" distR="114300" simplePos="0" relativeHeight="251660288" behindDoc="0" locked="0" layoutInCell="1" allowOverlap="1" wp14:anchorId="215BD9CB" wp14:editId="6F6C32ED">
+                <wp:simplePos x="0" y="0"/>
+                <wp:positionH relativeFrom="column">
+                  <wp:posOffset>5339080</wp:posOffset>
+                </wp:positionH>
+                <wp:positionV relativeFrom="paragraph">
+                  <wp:posOffset>1468427</wp:posOffset>
+                </wp:positionV>
+                <wp:extent cx="419135" cy="227566"/>
+                <wp:effectExtent l="0" t="0" r="0" b="1270"/>
+                <wp:wrapNone/>
+                <wp:docPr id="1282473095" name="Textfeld 2"/>
+                <wp:cNvGraphicFramePr/>
+                <a:graphic xmlns:a="http://schemas.openxmlformats.org/drawingml/2006/main">
+                  <a:graphicData uri="http://schemas.microsoft.com/office/word/2010/wordprocessingShape">
+                    <wps:wsp>
+                      <wps:cNvSpPr txBox="1"/>
+                      <wps:spPr>
+                        <a:xfrm>
+                          <a:off x="0" y="0"/>
+                          <a:ext cx="419135" cy="227566"/>
+                        </a:xfrm>
+                        <a:prstGeom prst="rect">
+                          <a:avLst/>
+                        </a:prstGeom>
+                        <a:noFill/>
+                        <a:ln w="6350">
+                          <a:noFill/>
+                        </a:ln>
+                      </wps:spPr>
+                      <wps:txbx>
+                        <w:txbxContent>
+                          <w:p>
+                            <w:pPr>
+                              <w:rPr>
+                                <w:color w:val="EE0000"/>
+                                <w:sz w:val="18"/>
+                                <w:szCs w:val="18"/>
+                              </w:rPr>
+                            </w:pPr>
+                            <w:r>
+                              <w:rPr>
+                                <w:color w:val="EE0000"/>
+                                <w:sz w:val="18"/>
+                                <w:szCs w:val="18"/>
+                              </w:rPr>
+                              <w:t>50Ω</w:t>
+                            </w:r>
+                          </w:p>
+                        </w:txbxContent>
+                      </wps:txbx>
+                      <wps:bodyPr rot="0" spcFirstLastPara="0" vertOverflow="overflow" horzOverflow="overflow" vert="horz" wrap="square" lIns="91440" tIns="45720" rIns="91440" bIns="45720" numCol="1" spcCol="0" rtlCol="0" fromWordArt="0" anchor="t" anchorCtr="0" forceAA="0" compatLnSpc="1">
+                        <a:prstTxWarp prst="textNoShape">
+                          <a:avLst/>
+                        </a:prstTxWarp>
+                        <a:noAutofit/>
+                      </wps:bodyPr>
+                    </wps:wsp>
+                  </a:graphicData>
+                </a:graphic>
+                <wp14:sizeRelH relativeFrom="margin">
+                  <wp14:pctWidth>0</wp14:pctWidth>
+                </wp14:sizeRelH>
+                <wp14:sizeRelV relativeFrom="margin">
+                  <wp14:pctHeight>0</wp14:pctHeight>
+                </wp14:sizeRelV>
+              </wp:anchor>
+            </w:drawing>
+          </mc:Choice>
+          <mc:Fallback>
+            <w:pict>
+              <v:shape w14:anchorId="215BD9CB" id="_x0000_s1028" type="#_x0000_t202" style="position:absolute;margin-left:420.4pt;margin-top:115.6pt;width:33pt;height:17.9pt;z-index:251660288;visibility:visible;mso-wrap-style:square;mso-width-percent:0;mso-height-percent:0;mso-wrap-distance-left:9pt;mso-wrap-distance-top:0;mso-wrap-distance-right:9pt;mso-wrap-distance-bottom:0;mso-position-horizontal:absolute;mso-position-horizontal-relative:text;mso-position-vertical:absolute;mso-position-vertical-relative:text;mso-width-percent:0;mso-height-percent:0;mso-width-relative:margin;mso-height-relative:margin;v-text-anchor:top" o:gfxdata="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" filled="f" stroked="f" strokeweight=".5pt">
+                <v:textbox>
+                  <w:txbxContent>
+                    <w:p>
+                      <w:pPr>
+                        <w:rPr>
+                          <w:color w:val="EE0000"/>
+                          <w:sz w:val="18"/>
+                          <w:szCs w:val="18"/>
+                        </w:rPr>
+                      </w:pPr>
+                      <w:r>
+                        <w:rPr>
+                          <w:color w:val="EE0000"/>
+                          <w:sz w:val="18"/>
+                          <w:szCs w:val="18"/>
+                        </w:rPr>
+                        <w:t>50Ω</w:t>
+                      </w:r>
+                    </w:p>
+                  </w:txbxContent>
+                </v:textbox>
+              </v:shape>
+            </w:pict>
+          </mc:Fallback>
+        </mc:AlternateContent>
+      </w:r>
+      <w:r>
+        <w:rPr>
+          <w:noProof/>
+        </w:rPr>
+        <mc:AlternateContent>
+          <mc:Choice Requires="wps">
+            <w:drawing>
+              <wp:anchor distT="0" distB="0" distL="114300" distR="114300" simplePos="0" relativeHeight="251659264" behindDoc="0" locked="0" layoutInCell="1" allowOverlap="1" wp14:anchorId="6D42AAD2" wp14:editId="7556ADD2">
+                <wp:simplePos x="0" y="0"/>
+                <wp:positionH relativeFrom="column">
+                  <wp:posOffset>2834005</wp:posOffset>
+                </wp:positionH>
+                <wp:positionV relativeFrom="paragraph">
+                  <wp:posOffset>1588249</wp:posOffset>
+                </wp:positionV>
+                <wp:extent cx="2590800" cy="0"/>
+                <wp:effectExtent l="0" t="0" r="0" b="0"/>
+                <wp:wrapNone/>
+                <wp:docPr id="48654086" name="Gerader Verbinder 1"/>
+                <wp:cNvGraphicFramePr/>
+                <a:graphic xmlns:a="http://schemas.openxmlformats.org/drawingml/2006/main">
+                  <a:graphicData uri="http://schemas.microsoft.com/office/word/2010/wordprocessingShape">
+                    <wps:wsp>
+                      <wps:cNvCnPr/>
+                      <wps:spPr>
+                        <a:xfrm flipH="1">
+                          <a:off x="0" y="0"/>
+                          <a:ext cx="2590800" cy="0"/>
+                        </a:xfrm>
+                        <a:prstGeom prst="line">
+                          <a:avLst/>
+                        </a:prstGeom>
+                        <a:ln w="12700">
+                          <a:solidFill>
+                            <a:srgbClr val="EE0000"/>
+                          </a:solidFill>
+                        </a:ln>
+                      </wps:spPr>
+                      <wps:style>
+                        <a:lnRef idx="2">
+                          <a:schemeClr val="accent1"/>
+                        </a:lnRef>
+                        <a:fillRef idx="0">
+                          <a:schemeClr val="accent1"/>
+                        </a:fillRef>
+                        <a:effectRef idx="1">
+                          <a:schemeClr val="accent1"/>
+                        </a:effectRef>
+                        <a:fontRef idx="minor">
+                          <a:schemeClr val="tx1"/>
+                        </a:fontRef>
+                      </wps:style>
+                      <wps:bodyPr/>
+                    </wps:wsp>
+                  </a:graphicData>
+                </a:graphic>
+              </wp:anchor>
+            </w:drawing>
+          </mc:Choice>
+          <mc:Fallback>
+            <w:pict>
+              <v:line w14:anchorId="4B5DC788" id="Gerader Verbinder 1" o:spid="_x0000_s1026" style="position:absolute;flip:x;z-index:251659264;visibility:visible;mso-wrap-style:square;mso-wrap-distance-left:9pt;mso-wrap-distance-top:0;mso-wrap-distance-right:9pt;mso-wrap-distance-bottom:0;mso-position-horizontal:absolute;mso-position-horizontal-relative:text;mso-position-vertical:absolute;mso-position-vertical-relative:text" from="223.15pt,125.05pt" to="427.15pt,125.05pt" o:gfxdata="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" strokecolor="#e00" strokeweight="1pt">
+                <v:stroke joinstyle="miter"/>
+              </v:line>
+            </w:pict>
+          </mc:Fallback>
+        </mc:AlternateContent>
+      </w:r>
+      <w:r>
+        <w:drawing>
+          <wp:inline distT="0" distB="0" distL="0" distR="0" wp14:anchorId="5FC970B5" wp14:editId="456FBFFD">
+            <wp:extent cx="5760720" cy="2326005"/>
+            <wp:effectExtent l="0" t="0" r="0" b="0"/>
+            <wp:docPr id="1971924727" name="Grafik 1"/>
+            <wp:cNvGraphicFramePr>
+              <a:graphicFrameLocks xmlns:a="http://schemas.openxmlformats.org/drawingml/2006/main" noChangeAspect="1"/>
+            </wp:cNvGraphicFramePr>
+            <a:graphic xmlns:a="http://schemas.openxmlformats.org/drawingml/2006/main">
+              <a:graphicData uri="http://schemas.openxmlformats.org/drawingml/2006/picture">
+                <pic:pic xmlns:pic="http://schemas.openxmlformats.org/drawingml/2006/picture">
+                  <pic:nvPicPr>
+                    <pic:cNvPr id="1971924727" name=""/>
+                    <pic:cNvPicPr/>
+                  </pic:nvPicPr>
+                  <pic:blipFill>
+                    <a:blip r:embed="rId10"/>
+                    <a:stretch>
+                      <a:fillRect/>
+                    </a:stretch>
+                  </pic:blipFill>
+                  <pic:spPr>
+                    <a:xfrm>
+                      <a:off x="0" y="0"/>
+                      <a:ext cx="5760720" cy="2326005"/>
+                    </a:xfrm>
+                    <a:prstGeom prst="rect">
+                      <a:avLst/>
+                    </a:prstGeom>
+                  </pic:spPr>
+                </pic:pic>
+              </a:graphicData>
+            </a:graphic>
+          </wp:inline>
+        </w:drawing>
+      </w:r>
+    </w:p>
+    <w:p>
+      <w:r>
+        <w:rPr>
+          <w:noProof/>
+        </w:rPr>
+        <w:lastRenderedPageBreak/>
+        <mc:AlternateContent>
+          <mc:Choice Requires="wps">
+            <w:drawing>
+              <wp:anchor distT="0" distB="0" distL="114300" distR="114300" simplePos="0" relativeHeight="251675648" behindDoc="0" locked="0" layoutInCell="1" allowOverlap="1" wp14:anchorId="4389F196" wp14:editId="5034FB4B">
+                <wp:simplePos x="0" y="0"/>
+                <wp:positionH relativeFrom="column">
+                  <wp:posOffset>-50151</wp:posOffset>
+                </wp:positionH>
+                <wp:positionV relativeFrom="paragraph">
+                  <wp:posOffset>2311658</wp:posOffset>
+                </wp:positionV>
+                <wp:extent cx="567731" cy="437104"/>
+                <wp:effectExtent l="0" t="0" r="0" b="1270"/>
+                <wp:wrapNone/>
+                <wp:docPr id="231573328" name="Textfeld 2"/>
+                <wp:cNvGraphicFramePr/>
+                <a:graphic xmlns:a="http://schemas.openxmlformats.org/drawingml/2006/main">
+                  <a:graphicData uri="http://schemas.microsoft.com/office/word/2010/wordprocessingShape">
+                    <wps:wsp>
+                      <wps:cNvSpPr txBox="1"/>
+                      <wps:spPr>
+                        <a:xfrm>
+                          <a:off x="0" y="0"/>
+                          <a:ext cx="567731" cy="437104"/>
+                        </a:xfrm>
+                        <a:prstGeom prst="rect">
+                          <a:avLst/>
+                        </a:prstGeom>
+                        <a:noFill/>
+                        <a:ln w="6350">
+                          <a:noFill/>
+                        </a:ln>
+                      </wps:spPr>
+                      <wps:txbx>
+                        <w:txbxContent>
+                          <w:p>
+                            <w:pPr>
+                              <w:jc w:val="center"/>
+                              <w:rPr>
+                                <w:color w:val="000000" w:themeColor="text1"/>
+                                <w:sz w:val="22"/>
+                                <w:szCs w:val="22"/>
+                                <w:vertAlign w:val="superscript"/>
+                              </w:rPr>
+                            </w:pPr>
+                            <m:oMathPara>
+                              <m:oMath>
+                                <m:sSub>
+                                  <m:sSubPr>
+                                    <m:ctrlPr>
+                                      <w:rPr>
+                                        <w:rFonts w:ascii="Cambria Math" w:hAnsi="Cambria Math"/>
+                                        <w:i/>
+                                        <w:sz w:val="22"/>
+                                        <w:szCs w:val="22"/>
+                                      </w:rPr>
+                                    </m:ctrlPr>
+                                  </m:sSubPr>
+                                  <m:e>
+                                    <m:r>
+                                      <w:rPr>
+                                        <w:rFonts w:ascii="Cambria Math" w:hAnsi="Cambria Math"/>
+                                        <w:sz w:val="22"/>
+                                        <w:szCs w:val="22"/>
+                                      </w:rPr>
+                                      <m:t>ε</m:t>
+                                    </m:r>
+                                  </m:e>
+                                  <m:sub>
+                                    <m:r>
+                                      <w:rPr>
+                                        <w:rFonts w:ascii="Cambria Math" w:hAnsi="Cambria Math"/>
+                                        <w:sz w:val="22"/>
+                                        <w:szCs w:val="22"/>
+                                      </w:rPr>
+                                      <m:t>r,eff</m:t>
+                                    </m:r>
+                                  </m:sub>
+                                </m:sSub>
+                                <m:r>
+                                  <w:rPr>
+                                    <w:rFonts w:eastAsiaTheme="minorEastAsia"/>
+                                    <w:sz w:val="22"/>
+                                    <w:szCs w:val="22"/>
+                                  </w:rPr>
+                                  <w:br/>
+                                </m:r>
+                              </m:oMath>
+                            </m:oMathPara>
+                            <w:r>
+                              <w:rPr>
+                                <w:color w:val="000000" w:themeColor="text1"/>
+                                <w:sz w:val="22"/>
+                                <w:szCs w:val="22"/>
+                                <w:vertAlign w:val="superscript"/>
+                              </w:rPr>
+                              <w:t>≈ 3,5</w:t>
+                            </w:r>
+                          </w:p>
+                        </w:txbxContent>
+                      </wps:txbx>
+                      <wps:bodyPr rot="0" spcFirstLastPara="0" vertOverflow="overflow" horzOverflow="overflow" vert="horz" wrap="square" lIns="91440" tIns="45720" rIns="91440" bIns="45720" numCol="1" spcCol="0" rtlCol="0" fromWordArt="0" anchor="t" anchorCtr="0" forceAA="0" compatLnSpc="1">
+                        <a:prstTxWarp prst="textNoShape">
+                          <a:avLst/>
+                        </a:prstTxWarp>
+                        <a:noAutofit/>
+                      </wps:bodyPr>
+                    </wps:wsp>
+                  </a:graphicData>
+                </a:graphic>
+                <wp14:sizeRelH relativeFrom="margin">
+                  <wp14:pctWidth>0</wp14:pctWidth>
+                </wp14:sizeRelH>
+                <wp14:sizeRelV relativeFrom="margin">
+                  <wp14:pctHeight>0</wp14:pctHeight>
+                </wp14:sizeRelV>
+              </wp:anchor>
+            </w:drawing>
+          </mc:Choice>
+          <mc:Fallback>
+            <w:pict>
+              <v:shape w14:anchorId="4389F196" id="_x0000_s1029" type="#_x0000_t202" style="position:absolute;margin-left:-3.95pt;margin-top:182pt;width:44.7pt;height:34.4pt;z-index:251675648;visibility:visible;mso-wrap-style:square;mso-width-percent:0;mso-height-percent:0;mso-wrap-distance-left:9pt;mso-wrap-distance-top:0;mso-wrap-distance-right:9pt;mso-wrap-distance-bottom:0;mso-position-horizontal:absolute;mso-position-horizontal-relative:text;mso-position-vertical:absolute;mso-position-vertical-relative:text;mso-width-percent:0;mso-height-percent:0;mso-width-relative:margin;mso-height-relative:margin;v-text-anchor:top" o:gfxdata="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" filled="f" stroked="f" strokeweight=".5pt">
+                <v:textbox>
+                  <w:txbxContent>
+                    <w:p>
+                      <w:pPr>
+                        <w:jc w:val="center"/>
+                        <w:rPr>
+                          <w:color w:val="000000" w:themeColor="text1"/>
+                          <w:sz w:val="22"/>
+                          <w:szCs w:val="22"/>
+                          <w:vertAlign w:val="superscript"/>
+                        </w:rPr>
+                      </w:pPr>
+                      <m:oMathPara>
+                        <m:oMath>
+                          <m:sSub>
+                            <m:sSubPr>
+                              <m:ctrlPr>
+                                <w:rPr>
+                                  <w:rFonts w:ascii="Cambria Math" w:hAnsi="Cambria Math"/>
+                                  <w:i/>
+                                  <w:sz w:val="22"/>
+                                  <w:szCs w:val="22"/>
+                                </w:rPr>
+                              </m:ctrlPr>
+                            </m:sSubPr>
+                            <m:e>
+                              <m:r>
+                                <w:rPr>
+                                  <w:rFonts w:ascii="Cambria Math" w:hAnsi="Cambria Math"/>
+                                  <w:sz w:val="22"/>
+                                  <w:szCs w:val="22"/>
+                                </w:rPr>
+                                <m:t>ε</m:t>
+                              </m:r>
+                            </m:e>
+                            <m:sub>
+                              <m:r>
+                                <w:rPr>
+                                  <w:rFonts w:ascii="Cambria Math" w:hAnsi="Cambria Math"/>
+                                  <w:sz w:val="22"/>
+                                  <w:szCs w:val="22"/>
+                                </w:rPr>
+                                <m:t>r,eff</m:t>
+                              </m:r>
+                            </m:sub>
+                          </m:sSub>
+                          <m:r>
+                            <w:rPr>
+                              <w:rFonts w:eastAsiaTheme="minorEastAsia"/>
+                              <w:sz w:val="22"/>
+                              <w:szCs w:val="22"/>
+                            </w:rPr>
+                            <w:br/>
+                          </m:r>
+                        </m:oMath>
+                      </m:oMathPara>
+                      <w:r>
+                        <w:rPr>
+                          <w:color w:val="000000" w:themeColor="text1"/>
+                          <w:sz w:val="22"/>
+                          <w:szCs w:val="22"/>
+                          <w:vertAlign w:val="superscript"/>
+                        </w:rPr>
+                        <w:t>≈ 3,5</w:t>
+                      </w:r>
+                    </w:p>
+                  </w:txbxContent>
+                </v:textbox>
+              </v:shape>
+            </w:pict>
+          </mc:Fallback>
+        </mc:AlternateContent>
+      </w:r>
+      <w:r>
+        <w:rPr>
+          <w:noProof/>
+        </w:rPr>
+        <mc:AlternateContent>
+          <mc:Choice Requires="wps">
+            <w:drawing>
+              <wp:anchor distT="0" distB="0" distL="114300" distR="114300" simplePos="0" relativeHeight="251669504" behindDoc="0" locked="0" layoutInCell="1" allowOverlap="1" wp14:anchorId="1B8B9124" wp14:editId="29D32E1E">
+                <wp:simplePos x="0" y="0"/>
+                <wp:positionH relativeFrom="column">
+                  <wp:posOffset>431165</wp:posOffset>
+                </wp:positionH>
+                <wp:positionV relativeFrom="paragraph">
+                  <wp:posOffset>2473904</wp:posOffset>
+                </wp:positionV>
+                <wp:extent cx="3069590" cy="0"/>
+                <wp:effectExtent l="0" t="0" r="0" b="0"/>
+                <wp:wrapNone/>
+                <wp:docPr id="740155566" name="Gerader Verbinder 10"/>
+                <wp:cNvGraphicFramePr/>
+                <a:graphic xmlns:a="http://schemas.openxmlformats.org/drawingml/2006/main">
+                  <a:graphicData uri="http://schemas.microsoft.com/office/word/2010/wordprocessingShape">
+                    <wps:wsp>
+                      <wps:cNvCnPr/>
+                      <wps:spPr>
+                        <a:xfrm flipH="1">
+                          <a:off x="0" y="0"/>
+                          <a:ext cx="3069590" cy="0"/>
+                        </a:xfrm>
+                        <a:prstGeom prst="line">
+                          <a:avLst/>
+                        </a:prstGeom>
+                        <a:ln w="12700">
+                          <a:solidFill>
+                            <a:schemeClr val="tx1"/>
+                          </a:solidFill>
+                        </a:ln>
+                      </wps:spPr>
+                      <wps:style>
+                        <a:lnRef idx="2">
+                          <a:schemeClr val="accent1"/>
+                        </a:lnRef>
+                        <a:fillRef idx="0">
+                          <a:schemeClr val="accent1"/>
+                        </a:fillRef>
+                        <a:effectRef idx="1">
+                          <a:schemeClr val="accent1"/>
+                        </a:effectRef>
+                        <a:fontRef idx="minor">
+                          <a:schemeClr val="tx1"/>
+                        </a:fontRef>
+                      </wps:style>
+                      <wps:bodyPr/>
+                    </wps:wsp>
+                  </a:graphicData>
+                </a:graphic>
+              </wp:anchor>
+            </w:drawing>
+          </mc:Choice>
+          <mc:Fallback>
+            <w:pict>
+              <v:line w14:anchorId="4CFA255C" id="Gerader Verbinder 10" o:spid="_x0000_s1026" style="position:absolute;flip:x;z-index:251669504;visibility:visible;mso-wrap-style:square;mso-wrap-distance-left:9pt;mso-wrap-distance-top:0;mso-wrap-distance-right:9pt;mso-wrap-distance-bottom:0;mso-position-horizontal:absolute;mso-position-horizontal-relative:text;mso-position-vertical:absolute;mso-position-vertical-relative:text" from="33.95pt,194.8pt" to="275.65pt,194.8pt" o:gfxdata="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" strokecolor="black [3213]" strokeweight="1pt">
+                <v:stroke joinstyle="miter"/>
+              </v:line>
+            </w:pict>
+          </mc:Fallback>
+        </mc:AlternateContent>
+      </w:r>
+      <w:r>
+        <w:rPr>
+          <w:noProof/>
+        </w:rPr>
+        <mc:AlternateContent>
+          <mc:Choice Requires="wps">
+            <w:drawing>
+              <wp:anchor distT="0" distB="0" distL="114300" distR="114300" simplePos="0" relativeHeight="251665408" behindDoc="0" locked="0" layoutInCell="1" allowOverlap="1" wp14:anchorId="06192FF3" wp14:editId="0CBAEB63">
+                <wp:simplePos x="0" y="0"/>
+                <wp:positionH relativeFrom="column">
+                  <wp:posOffset>3501383</wp:posOffset>
+                </wp:positionH>
+                <wp:positionV relativeFrom="paragraph">
+                  <wp:posOffset>2471427</wp:posOffset>
+                </wp:positionV>
+                <wp:extent cx="181" cy="1771162"/>
+                <wp:effectExtent l="0" t="0" r="38100" b="19685"/>
+                <wp:wrapNone/>
+                <wp:docPr id="1199874734" name="Gerader Verbinder 7"/>
+                <wp:cNvGraphicFramePr/>
+                <a:graphic xmlns:a="http://schemas.openxmlformats.org/drawingml/2006/main">
+                  <a:graphicData uri="http://schemas.microsoft.com/office/word/2010/wordprocessingShape">
+                    <wps:wsp>
+                      <wps:cNvCnPr/>
+                      <wps:spPr>
+                        <a:xfrm flipV="1">
+                          <a:off x="0" y="0"/>
+                          <a:ext cx="181" cy="1771162"/>
+                        </a:xfrm>
+                        <a:prstGeom prst="line">
+                          <a:avLst/>
+                        </a:prstGeom>
+                        <a:ln w="12700">
+                          <a:solidFill>
+                            <a:schemeClr val="tx1"/>
+                          </a:solidFill>
+                        </a:ln>
+                      </wps:spPr>
+                      <wps:style>
+                        <a:lnRef idx="2">
+                          <a:schemeClr val="accent1"/>
+                        </a:lnRef>
+                        <a:fillRef idx="0">
+                          <a:schemeClr val="accent1"/>
+                        </a:fillRef>
+                        <a:effectRef idx="1">
+                          <a:schemeClr val="accent1"/>
+                        </a:effectRef>
+                        <a:fontRef idx="minor">
+                          <a:schemeClr val="tx1"/>
+                        </a:fontRef>
+                      </wps:style>
+                      <wps:bodyPr/>
+                    </wps:wsp>
+                  </a:graphicData>
+                </a:graphic>
+                <wp14:sizeRelV relativeFrom="margin">
+                  <wp14:pctHeight>0</wp14:pctHeight>
+                </wp14:sizeRelV>
+              </wp:anchor>
+            </w:drawing>
+          </mc:Choice>
+          <mc:Fallback>
+            <w:pict>
+              <v:line w14:anchorId="37824D9A" id="Gerader Verbinder 7" o:spid="_x0000_s1026" style="position:absolute;flip:y;z-index:251665408;visibility:visible;mso-wrap-style:square;mso-height-percent:0;mso-wrap-distance-left:9pt;mso-wrap-distance-top:0;mso-wrap-distance-right:9pt;mso-wrap-distance-bottom:0;mso-position-horizontal:absolute;mso-position-horizontal-relative:text;mso-position-vertical:absolute;mso-position-vertical-relative:text;mso-height-percent:0;mso-height-relative:margin" from="275.7pt,194.6pt" to="275.7pt,334.05pt" o:gfxdata="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" strokecolor="black [3213]" strokeweight="1pt">
+                <v:stroke joinstyle="miter"/>
+              </v:line>
+            </w:pict>
+          </mc:Fallback>
+        </mc:AlternateContent>
+      </w:r>
+      <w:r>
+        <w:rPr>
+          <w:noProof/>
+        </w:rPr>
+        <mc:AlternateContent>
+          <mc:Choice Requires="wps">
+            <w:drawing>
+              <wp:anchor distT="0" distB="0" distL="114300" distR="114300" simplePos="0" relativeHeight="251666432" behindDoc="0" locked="0" layoutInCell="1" allowOverlap="1" wp14:anchorId="3762D3C9" wp14:editId="3C62F8BB">
+                <wp:simplePos x="0" y="0"/>
+                <wp:positionH relativeFrom="column">
+                  <wp:posOffset>516890</wp:posOffset>
+                </wp:positionH>
+                <wp:positionV relativeFrom="paragraph">
+                  <wp:posOffset>2270181</wp:posOffset>
+                </wp:positionV>
+                <wp:extent cx="4872990" cy="386715"/>
+                <wp:effectExtent l="0" t="0" r="22860" b="13335"/>
+                <wp:wrapNone/>
+                <wp:docPr id="833420671" name="Freihandform: Form 9"/>
+                <wp:cNvGraphicFramePr/>
+                <a:graphic xmlns:a="http://schemas.openxmlformats.org/drawingml/2006/main">
+                  <a:graphicData uri="http://schemas.microsoft.com/office/word/2010/wordprocessingShape">
+                    <wps:wsp>
+                      <wps:cNvSpPr/>
+                      <wps:spPr>
+                        <a:xfrm>
+                          <a:off x="0" y="0"/>
+                          <a:ext cx="4872990" cy="386715"/>
+                        </a:xfrm>
+                        <a:custGeom>
+                          <a:avLst/>
+                          <a:gdLst>
+                            <a:gd name="csX0" fmla="*/ 4873450 w 4873450"/>
+                            <a:gd name="csY0" fmla="*/ 0 h 386861"/>
+                            <a:gd name="csX1" fmla="*/ 3125037 w 4873450"/>
+                            <a:gd name="csY1" fmla="*/ 180870 h 386861"/>
+                            <a:gd name="csX2" fmla="*/ 1703195 w 4873450"/>
+                            <a:gd name="csY2" fmla="*/ 341644 h 386861"/>
+                            <a:gd name="csX3" fmla="*/ 0 w 4873450"/>
+                            <a:gd name="csY3" fmla="*/ 386861 h 386861"/>
+                          </a:gdLst>
+                          <a:ahLst/>
+                          <a:cxnLst>
+                            <a:cxn ang="0">
+                              <a:pos x="csX0" y="csY0"/>
+                            </a:cxn>
+                            <a:cxn ang="0">
+                              <a:pos x="csX1" y="csY1"/>
+                            </a:cxn>
+                            <a:cxn ang="0">
+                              <a:pos x="csX2" y="csY2"/>
+                            </a:cxn>
+                            <a:cxn ang="0">
+                              <a:pos x="csX3" y="csY3"/>
+                            </a:cxn>
+                          </a:cxnLst>
+                          <a:rect l="l" t="t" r="r" b="b"/>
+                          <a:pathLst>
+                            <a:path w="4873450" h="386861">
+                              <a:moveTo>
+                                <a:pt x="4873450" y="0"/>
+                              </a:moveTo>
+                              <a:lnTo>
+                                <a:pt x="3125037" y="180870"/>
+                              </a:lnTo>
+                              <a:cubicBezTo>
+                                <a:pt x="2596661" y="237811"/>
+                                <a:pt x="2224034" y="307312"/>
+                                <a:pt x="1703195" y="341644"/>
+                              </a:cubicBezTo>
+                              <a:cubicBezTo>
+                                <a:pt x="1182355" y="375976"/>
+                                <a:pt x="591177" y="381418"/>
+                                <a:pt x="0" y="386861"/>
+                              </a:cubicBezTo>
+                            </a:path>
+                          </a:pathLst>
+                        </a:custGeom>
+                        <a:noFill/>
+                        <a:ln w="12700">
+                          <a:solidFill>
+                            <a:schemeClr val="accent2">
+                              <a:lumMod val="60000"/>
+                              <a:lumOff val="40000"/>
+                            </a:schemeClr>
+                          </a:solidFill>
+                        </a:ln>
+                      </wps:spPr>
+                      <wps:style>
+                        <a:lnRef idx="2">
+                          <a:schemeClr val="accent1">
+                            <a:shade val="15000"/>
+                          </a:schemeClr>
+                        </a:lnRef>
+                        <a:fillRef idx="1">
+                          <a:schemeClr val="accent1"/>
+                        </a:fillRef>
+                        <a:effectRef idx="0">
+                          <a:schemeClr val="accent1"/>
+                        </a:effectRef>
+                        <a:fontRef idx="minor">
+                          <a:schemeClr val="lt1"/>
+                        </a:fontRef>
+                      </wps:style>
+                      <wps:bodyPr rot="0" spcFirstLastPara="0" vertOverflow="overflow" horzOverflow="overflow" vert="horz" wrap="square" lIns="91440" tIns="45720" rIns="91440" bIns="45720" numCol="1" spcCol="0" rtlCol="0" fromWordArt="0" anchor="ctr" anchorCtr="0" forceAA="0" compatLnSpc="1">
+                        <a:prstTxWarp prst="textNoShape">
+                          <a:avLst/>
+                        </a:prstTxWarp>
+                        <a:noAutofit/>
+                      </wps:bodyPr>
+                    </wps:wsp>
+                  </a:graphicData>
+                </a:graphic>
+              </wp:anchor>
+            </w:drawing>
+          </mc:Choice>
+          <mc:Fallback>
+            <w:pict>
+              <v:shape w14:anchorId="0FB1FA68" id="Freihandform: Form 9" o:spid="_x0000_s1026" style="position:absolute;margin-left:40.7pt;margin-top:178.75pt;width:383.7pt;height:30.45pt;z-index:251666432;visibility:visible;mso-wrap-style:square;mso-wrap-distance-left:9pt;mso-wrap-distance-top:0;mso-wrap-distance-right:9pt;mso-wrap-distance-bottom:0;mso-position-horizontal:absolute;mso-position-horizontal-relative:text;mso-position-vertical:absolute;mso-position-vertical-relative:text;v-text-anchor:middle" coordsize="4873450,386861" o:gfxdata="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" path="m4873450,l3125037,180870c2596661,237811,2224034,307312,1703195,341644,1182355,375976,591177,381418,,386861e" filled="f" strokecolor="#f1a983 [1941]" strokeweight="1pt">
+                <v:stroke joinstyle="miter"/>
+                <v:path arrowok="t" o:connecttype="custom" o:connectlocs="4872990,0;3124742,180802;1703034,341515;0,386715" o:connectangles="0,0,0,0"/>
+              </v:shape>
+            </w:pict>
+          </mc:Fallback>
+        </mc:AlternateContent>
+      </w:r>
+      <w:r>
+        <w:rPr>
+          <w:noProof/>
+        </w:rPr>
+        <mc:AlternateContent>
+          <mc:Choice Requires="wps">
+            <w:drawing>
+              <wp:anchor distT="0" distB="0" distL="114300" distR="114300" simplePos="0" relativeHeight="251673600" behindDoc="0" locked="0" layoutInCell="1" allowOverlap="1" wp14:anchorId="27662F50" wp14:editId="0884BBA1">
+                <wp:simplePos x="0" y="0"/>
+                <wp:positionH relativeFrom="column">
+                  <wp:posOffset>3305399</wp:posOffset>
+                </wp:positionH>
+                <wp:positionV relativeFrom="paragraph">
+                  <wp:posOffset>4205459</wp:posOffset>
+                </wp:positionV>
+                <wp:extent cx="419135" cy="227566"/>
+                <wp:effectExtent l="0" t="0" r="0" b="1270"/>
+                <wp:wrapNone/>
+                <wp:docPr id="1359198459" name="Textfeld 2"/>
+                <wp:cNvGraphicFramePr/>
+                <a:graphic xmlns:a="http://schemas.openxmlformats.org/drawingml/2006/main">
+                  <a:graphicData uri="http://schemas.microsoft.com/office/word/2010/wordprocessingShape">
+                    <wps:wsp>
+                      <wps:cNvSpPr txBox="1"/>
+                      <wps:spPr>
+                        <a:xfrm>
+                          <a:off x="0" y="0"/>
+                          <a:ext cx="419135" cy="227566"/>
+                        </a:xfrm>
+                        <a:prstGeom prst="rect">
+                          <a:avLst/>
+                        </a:prstGeom>
+                        <a:noFill/>
+                        <a:ln w="6350">
+                          <a:noFill/>
+                        </a:ln>
+                      </wps:spPr>
+                      <wps:txbx>
+                        <w:txbxContent>
+                          <w:p>
+                            <w:pPr>
+                              <w:rPr>
+                                <w:color w:val="000000" w:themeColor="text1"/>
+                                <w:sz w:val="18"/>
+                                <w:szCs w:val="18"/>
+                                <w:vertAlign w:val="superscript"/>
+                              </w:rPr>
+                            </w:pPr>
+                            <w:r>
+                              <w:rPr>
+                                <w:color w:val="000000" w:themeColor="text1"/>
+                                <w:sz w:val="18"/>
+                                <w:szCs w:val="18"/>
+                              </w:rPr>
+                              <w:t>w/h</w:t>
+                            </w:r>
+                            <w:r>
+                              <w:rPr>
+                                <w:color w:val="000000" w:themeColor="text1"/>
+                                <w:sz w:val="18"/>
+                                <w:szCs w:val="18"/>
+                                <w:vertAlign w:val="superscript"/>
+                              </w:rPr>
+                              <w:t>*</w:t>
+                            </w:r>
+                          </w:p>
+                        </w:txbxContent>
+                      </wps:txbx>
+                      <wps:bodyPr rot="0" spcFirstLastPara="0" vertOverflow="overflow" horzOverflow="overflow" vert="horz" wrap="square" lIns="91440" tIns="45720" rIns="91440" bIns="45720" numCol="1" spcCol="0" rtlCol="0" fromWordArt="0" anchor="t" anchorCtr="0" forceAA="0" compatLnSpc="1">
+                        <a:prstTxWarp prst="textNoShape">
+                          <a:avLst/>
+                        </a:prstTxWarp>
+                        <a:noAutofit/>
+                      </wps:bodyPr>
+                    </wps:wsp>
+                  </a:graphicData>
+                </a:graphic>
+                <wp14:sizeRelH relativeFrom="margin">
+                  <wp14:pctWidth>0</wp14:pctWidth>
+                </wp14:sizeRelH>
+                <wp14:sizeRelV relativeFrom="margin">
+                  <wp14:pctHeight>0</wp14:pctHeight>
+                </wp14:sizeRelV>
+              </wp:anchor>
+            </w:drawing>
+          </mc:Choice>
+          <mc:Fallback>
+            <w:pict>
+              <v:shape w14:anchorId="27662F50" id="_x0000_s1030" type="#_x0000_t202" style="position:absolute;margin-left:260.25pt;margin-top:331.15pt;width:33pt;height:17.9pt;z-index:251673600;visibility:visible;mso-wrap-style:square;mso-width-percent:0;mso-height-percent:0;mso-wrap-distance-left:9pt;mso-wrap-distance-top:0;mso-wrap-distance-right:9pt;mso-wrap-distance-bottom:0;mso-position-horizontal:absolute;mso-position-horizontal-relative:text;mso-position-vertical:absolute;mso-position-vertical-relative:text;mso-width-percent:0;mso-height-percent:0;mso-width-relative:margin;mso-height-relative:margin;v-text-anchor:top" o:gfxdata="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" filled="f" stroked="f" strokeweight=".5pt">
+                <v:textbox>
+                  <w:txbxContent>
+                    <w:p>
+                      <w:pPr>
+                        <w:rPr>
+                          <w:color w:val="000000" w:themeColor="text1"/>
+                          <w:sz w:val="18"/>
+                          <w:szCs w:val="18"/>
+                          <w:vertAlign w:val="superscript"/>
+                        </w:rPr>
+                      </w:pPr>
+                      <w:r>
+                        <w:rPr>
+                          <w:color w:val="000000" w:themeColor="text1"/>
+                          <w:sz w:val="18"/>
+                          <w:szCs w:val="18"/>
+                        </w:rPr>
+                        <w:t>w/h</w:t>
+                      </w:r>
+                      <w:r>
+                        <w:rPr>
+                          <w:color w:val="000000" w:themeColor="text1"/>
+                          <w:sz w:val="18"/>
+                          <w:szCs w:val="18"/>
+                          <w:vertAlign w:val="superscript"/>
+                        </w:rPr>
+                        <w:t>*</w:t>
+                      </w:r>
+                    </w:p>
+                  </w:txbxContent>
+                </v:textbox>
+              </v:shape>
+            </w:pict>
+          </mc:Fallback>
+        </mc:AlternateContent>
+      </w:r>
+      <w:r>
+        <w:rPr>
+          <w:noProof/>
+        </w:rPr>
+        <mc:AlternateContent>
+          <mc:Choice Requires="wps">
+            <w:drawing>
+              <wp:anchor distT="0" distB="0" distL="114300" distR="114300" simplePos="0" relativeHeight="251668480" behindDoc="0" locked="0" layoutInCell="1" allowOverlap="1" wp14:anchorId="3BCF0D50" wp14:editId="53D51D42">
+                <wp:simplePos x="0" y="0"/>
+                <wp:positionH relativeFrom="column">
+                  <wp:posOffset>5340824</wp:posOffset>
+                </wp:positionH>
+                <wp:positionV relativeFrom="paragraph">
+                  <wp:posOffset>2084712</wp:posOffset>
+                </wp:positionV>
+                <wp:extent cx="419135" cy="227566"/>
+                <wp:effectExtent l="0" t="0" r="0" b="1270"/>
+                <wp:wrapNone/>
+                <wp:docPr id="2125953543" name="Textfeld 2"/>
+                <wp:cNvGraphicFramePr/>
+                <a:graphic xmlns:a="http://schemas.openxmlformats.org/drawingml/2006/main">
+                  <a:graphicData uri="http://schemas.microsoft.com/office/word/2010/wordprocessingShape">
+                    <wps:wsp>
+                      <wps:cNvSpPr txBox="1"/>
+                      <wps:spPr>
+                        <a:xfrm>
+                          <a:off x="0" y="0"/>
+                          <a:ext cx="419135" cy="227566"/>
+                        </a:xfrm>
+                        <a:prstGeom prst="rect">
+                          <a:avLst/>
+                        </a:prstGeom>
+                        <a:noFill/>
+                        <a:ln w="6350">
+                          <a:noFill/>
+                        </a:ln>
+                      </wps:spPr>
+                      <wps:txbx>
+                        <w:txbxContent>
+                          <w:p>
+                            <w:pPr>
+                              <w:rPr>
+                                <w:color w:val="F1A983" w:themeColor="accent2" w:themeTint="99"/>
+                                <w:sz w:val="18"/>
+                                <w:szCs w:val="18"/>
+                              </w:rPr>
+                            </w:pPr>
+                            <w:r>
+                              <w:rPr>
+                                <w:color w:val="F1A983" w:themeColor="accent2" w:themeTint="99"/>
+                                <w:sz w:val="18"/>
+                                <w:szCs w:val="18"/>
+                              </w:rPr>
+                              <w:t>≈4,7</w:t>
+                            </w:r>
+                          </w:p>
+                        </w:txbxContent>
+                      </wps:txbx>
+                      <wps:bodyPr rot="0" spcFirstLastPara="0" vertOverflow="overflow" horzOverflow="overflow" vert="horz" wrap="square" lIns="91440" tIns="45720" rIns="91440" bIns="45720" numCol="1" spcCol="0" rtlCol="0" fromWordArt="0" anchor="t" anchorCtr="0" forceAA="0" compatLnSpc="1">
+                        <a:prstTxWarp prst="textNoShape">
+                          <a:avLst/>
+                        </a:prstTxWarp>
+                        <a:noAutofit/>
+                      </wps:bodyPr>
+                    </wps:wsp>
+                  </a:graphicData>
+                </a:graphic>
+                <wp14:sizeRelH relativeFrom="margin">
+                  <wp14:pctWidth>0</wp14:pctWidth>
+                </wp14:sizeRelH>
+                <wp14:sizeRelV relativeFrom="margin">
+                  <wp14:pctHeight>0</wp14:pctHeight>
+                </wp14:sizeRelV>
+              </wp:anchor>
+            </w:drawing>
+          </mc:Choice>
+          <mc:Fallback>
+            <w:pict>
+              <v:shape w14:anchorId="3BCF0D50" id="_x0000_s1031" type="#_x0000_t202" style="position:absolute;margin-left:420.55pt;margin-top:164.15pt;width:33pt;height:17.9pt;z-index:251668480;visibility:visible;mso-wrap-style:square;mso-width-percent:0;mso-height-percent:0;mso-wrap-distance-left:9pt;mso-wrap-distance-top:0;mso-wrap-distance-right:9pt;mso-wrap-distance-bottom:0;mso-position-horizontal:absolute;mso-position-horizontal-relative:text;mso-position-vertical:absolute;mso-position-vertical-relative:text;mso-width-percent:0;mso-height-percent:0;mso-width-relative:margin;mso-height-relative:margin;v-text-anchor:top" o:gfxdata="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" filled="f" stroked="f" strokeweight=".5pt">
+                <v:textbox>
+                  <w:txbxContent>
+                    <w:p>
+                      <w:pPr>
+                        <w:rPr>
+                          <w:color w:val="F1A983" w:themeColor="accent2" w:themeTint="99"/>
+                          <w:sz w:val="18"/>
+                          <w:szCs w:val="18"/>
+                        </w:rPr>
+                      </w:pPr>
+                      <w:r>
+                        <w:rPr>
+                          <w:color w:val="F1A983" w:themeColor="accent2" w:themeTint="99"/>
+                          <w:sz w:val="18"/>
+                          <w:szCs w:val="18"/>
+                        </w:rPr>
+                        <w:t>≈4,7</w:t>
+                      </w:r>
+                    </w:p>
+                  </w:txbxContent>
+                </v:textbox>
+              </v:shape>
+            </w:pict>
+          </mc:Fallback>
+        </mc:AlternateContent>
+      </w:r>
+      <w:r>
+        <w:drawing>
+          <wp:inline distT="0" distB="0" distL="0" distR="0" wp14:anchorId="4AB5FC10" wp14:editId="0FD20FE5">
+            <wp:extent cx="5760720" cy="4655185"/>
+            <wp:effectExtent l="0" t="0" r="0" b="0"/>
+            <wp:docPr id="1511575912" name="Grafik 1"/>
+            <wp:cNvGraphicFramePr>
+              <a:graphicFrameLocks xmlns:a="http://schemas.openxmlformats.org/drawingml/2006/main" noChangeAspect="1"/>
+            </wp:cNvGraphicFramePr>
+            <a:graphic xmlns:a="http://schemas.openxmlformats.org/drawingml/2006/main">
+              <a:graphicData uri="http://schemas.openxmlformats.org/drawingml/2006/picture">
+                <pic:pic xmlns:pic="http://schemas.openxmlformats.org/drawingml/2006/picture">
+                  <pic:nvPicPr>
+                    <pic:cNvPr id="1511575912" name=""/>
+                    <pic:cNvPicPr/>
+                  </pic:nvPicPr>
+                  <pic:blipFill>
+                    <a:blip r:embed="rId11"/>
+                    <a:stretch>
+                      <a:fillRect/>
+                    </a:stretch>
+                  </pic:blipFill>
+                  <pic:spPr>
+                    <a:xfrm>
+                      <a:off x="0" y="0"/>
+                      <a:ext cx="5760720" cy="4655185"/>
+                    </a:xfrm>
+                    <a:prstGeom prst="rect">
+                      <a:avLst/>
+                    </a:prstGeom>
+                  </pic:spPr>
+                </pic:pic>
+              </a:graphicData>
+            </a:graphic>
+          </wp:inline>
+        </w:drawing>
+      </w:r>
+    </w:p>
+    <w:p>
+      <w:pPr>
+        <w:rPr>
+          <w:rFonts w:eastAsiaTheme="minorEastAsia"/>
+        </w:rPr>
+      </w:pPr>
+      <w:r>
+        <w:t xml:space="preserve">Grafisch wird ein </w:t>
+      </w:r>
+      <m:oMath>
+        <m:sSub>
+          <m:sSubPr>
+            <m:ctrlPr>
+              <w:rPr>
+                <w:rFonts w:ascii="Cambria Math" w:hAnsi="Cambria Math"/>
+                <w:i/>
+              </w:rPr>
+            </m:ctrlPr>
+          </m:sSubPr>
+          <m:e>
+            <m:r>
+              <w:rPr>
+                <w:rFonts w:ascii="Cambria Math" w:hAnsi="Cambria Math"/>
+              </w:rPr>
+              <m:t>ε</m:t>
+            </m:r>
+          </m:e>
+          <m:sub>
+            <m:r>
+              <w:rPr>
+                <w:rFonts w:ascii="Cambria Math" w:hAnsi="Cambria Math"/>
+              </w:rPr>
+              <m:t>r,eff</m:t>
+            </m:r>
+          </m:sub>
+        </m:sSub>
+      </m:oMath>
+      <w:r>
+        <w:rPr>
+          <w:rFonts w:eastAsiaTheme="minorEastAsia"/>
+        </w:rPr>
+        <w:t xml:space="preserve"> von 3,5 ermittelt.</w:t>
+      </w:r>
+    </w:p>
+    <w:p>
+      <w:r>
+        <w:rPr>
+          <w:rFonts w:eastAsiaTheme="minorEastAsia"/>
+        </w:rPr>
+        <w:t xml:space="preserve">Nach diesem Verfahren kann schnell ein </w:t>
+      </w:r>
+      <m:oMath>
+        <m:sSub>
+          <m:sSubPr>
+            <m:ctrlPr>
+              <w:rPr>
+                <w:rFonts w:ascii="Cambria Math" w:hAnsi="Cambria Math"/>
+                <w:i/>
+              </w:rPr>
+            </m:ctrlPr>
+          </m:sSubPr>
+          <m:e>
+            <m:r>
+              <w:rPr>
+                <w:rFonts w:ascii="Cambria Math" w:hAnsi="Cambria Math"/>
+              </w:rPr>
+              <m:t>ε</m:t>
+            </m:r>
+          </m:e>
+          <m:sub>
+            <m:r>
+              <w:rPr>
+                <w:rFonts w:ascii="Cambria Math" w:hAnsi="Cambria Math"/>
+              </w:rPr>
+              <m:t>r,eff</m:t>
+            </m:r>
+          </m:sub>
+        </m:sSub>
+      </m:oMath>
+      <w:r>
+        <w:rPr>
+          <w:rFonts w:eastAsiaTheme="minorEastAsia"/>
+        </w:rPr>
+        <w:t xml:space="preserve"> gefunden werden</w:t>
+      </w:r>
+      <w:r>
+        <w:rPr>
+          <w:rFonts w:eastAsiaTheme="minorEastAsia"/>
+        </w:rPr>
+        <w:t>.</w:t>
+      </w:r>
+      <w:r>
+        <w:rPr>
+          <w:rFonts w:eastAsiaTheme="minorEastAsia"/>
+        </w:rPr>
+        <w:t xml:space="preserve"> </w:t>
+      </w:r>
+    </w:p>
+    <w:p>
+      <w:r>
+        <w:br w:type="page"/>
+      </w:r>
+    </w:p>
+    <w:p>
+      <w:pPr>
+        <w:pStyle w:val="berschrift3"/>
+      </w:pPr>
+      <w:r>
+        <w:lastRenderedPageBreak/>
+        <w:t>Ermittlung der Leitungslängen</w:t>
+      </w:r>
+    </w:p>
+    <w:p>
+      <w:r>
+        <w:drawing>
+          <wp:inline distT="0" distB="0" distL="0" distR="0" wp14:anchorId="460063BD" wp14:editId="248E7DEA">
+            <wp:extent cx="5760720" cy="2661920"/>
+            <wp:effectExtent l="0" t="0" r="0" b="5080"/>
+            <wp:docPr id="2143904939" name="Grafik 1"/>
+            <wp:cNvGraphicFramePr>
+              <a:graphicFrameLocks xmlns:a="http://schemas.openxmlformats.org/drawingml/2006/main" noChangeAspect="1"/>
+            </wp:cNvGraphicFramePr>
+            <a:graphic xmlns:a="http://schemas.openxmlformats.org/drawingml/2006/main">
+              <a:graphicData uri="http://schemas.openxmlformats.org/drawingml/2006/picture">
+                <pic:pic xmlns:pic="http://schemas.openxmlformats.org/drawingml/2006/picture">
+                  <pic:nvPicPr>
+                    <pic:cNvPr id="2143904939" name=""/>
+                    <pic:cNvPicPr/>
+                  </pic:nvPicPr>
+                  <pic:blipFill>
+                    <a:blip r:embed="rId12"/>
+                    <a:stretch>
+                      <a:fillRect/>
+                    </a:stretch>
+                  </pic:blipFill>
+                  <pic:spPr>
+                    <a:xfrm>
+                      <a:off x="0" y="0"/>
+                      <a:ext cx="5760720" cy="2661920"/>
+                    </a:xfrm>
+                    <a:prstGeom prst="rect">
+                      <a:avLst/>
+                    </a:prstGeom>
+                  </pic:spPr>
+                </pic:pic>
+              </a:graphicData>
+            </a:graphic>
+          </wp:inline>
+        </w:drawing>
+      </w:r>
+    </w:p>
+    <w:p>
+      <w:r>
+        <w:t xml:space="preserve">Die zuvor ermittelten Werte der Emitter Beschaltung für </w:t>
+      </w:r>
+      <w:proofErr w:type="gramStart"/>
+      <w:r>
+        <w:t>S(</w:t>
+      </w:r>
+      <w:proofErr w:type="gramEnd"/>
+      <w:r>
+        <w:t xml:space="preserve">1,1) und </w:t>
+      </w:r>
+      <w:proofErr w:type="gramStart"/>
+      <w:r>
+        <w:t>S(</w:t>
+      </w:r>
+      <w:proofErr w:type="gramEnd"/>
+      <w:r>
+        <w:t>2,2) werden zur Anpassung hergenommen.</w:t>
+      </w:r>
+    </w:p>
+    <w:p>
+      <w:pPr>
+        <w:pStyle w:val="berschrift4"/>
+      </w:pPr>
+      <w:r>
+        <w:t>Längen l1 und l2</w:t>
+      </w:r>
+    </w:p>
+    <w:p>
+      <w:r>
+        <w:t>Die Anpassung</w:t>
+      </w:r>
+      <w:r>
+        <w:t xml:space="preserve"> von </w:t>
+      </w:r>
+      <w:proofErr w:type="gramStart"/>
+      <w:r>
+        <w:t>S(</w:t>
+      </w:r>
+      <w:proofErr w:type="gramEnd"/>
+      <w:r>
+        <w:t>1,1) zum Generator</w:t>
+      </w:r>
+      <w:r>
+        <w:t xml:space="preserve"> soll </w:t>
+      </w:r>
+      <w:r>
+        <w:t>mit einer Längs- und einer offenen Stichleitung umgesetzt werden.</w:t>
+      </w:r>
+    </w:p>
+    <w:p>
+      <w:pPr>
+        <w:keepNext/>
+      </w:pPr>
+      <w:r>
+        <w:rPr>
+          <w:noProof/>
+        </w:rPr>
+        <mc:AlternateContent>
+          <mc:Choice Requires="wps">
+            <w:drawing>
+              <wp:anchor distT="0" distB="0" distL="114300" distR="114300" simplePos="0" relativeHeight="251678720" behindDoc="0" locked="0" layoutInCell="1" allowOverlap="1" wp14:anchorId="5C336933" wp14:editId="14024B2D">
+                <wp:simplePos x="0" y="0"/>
+                <wp:positionH relativeFrom="column">
+                  <wp:posOffset>3561080</wp:posOffset>
+                </wp:positionH>
+                <wp:positionV relativeFrom="paragraph">
+                  <wp:posOffset>2747010</wp:posOffset>
+                </wp:positionV>
+                <wp:extent cx="1581150" cy="635"/>
+                <wp:effectExtent l="0" t="0" r="0" b="0"/>
+                <wp:wrapSquare wrapText="bothSides"/>
+                <wp:docPr id="1643623351" name="Textfeld 1"/>
+                <wp:cNvGraphicFramePr/>
+                <a:graphic xmlns:a="http://schemas.openxmlformats.org/drawingml/2006/main">
+                  <a:graphicData uri="http://schemas.microsoft.com/office/word/2010/wordprocessingShape">
+                    <wps:wsp>
+                      <wps:cNvSpPr txBox="1"/>
+                      <wps:spPr>
+                        <a:xfrm>
+                          <a:off x="0" y="0"/>
+                          <a:ext cx="1581150" cy="635"/>
+                        </a:xfrm>
+                        <a:prstGeom prst="rect">
+                          <a:avLst/>
+                        </a:prstGeom>
+                        <a:solidFill>
+                          <a:prstClr val="white"/>
+                        </a:solidFill>
+                        <a:ln>
+                          <a:noFill/>
+                        </a:ln>
+                      </wps:spPr>
+                      <wps:txbx>
+                        <w:txbxContent>
+                          <w:p>
+                            <w:pPr>
+                              <w:pStyle w:val="Beschriftung"/>
+                            </w:pPr>
+                            <w:r>
+                              <w:t xml:space="preserve">Abbildung </w:t>
+                            </w:r>
+                            <w:fldSimple w:instr=" SEQ Abbildung \* ARABIC ">
+                              <w:r>
+                                <w:rPr>
+                                  <w:noProof/>
+                                </w:rPr>
+                                <w:t>2</w:t>
+                              </w:r>
+                            </w:fldSimple>
+                            <w:r>
+                              <w:t xml:space="preserve"> Beschaltung der Anpassung mit Leitungslängen</w:t>
+                            </w:r>
+                          </w:p>
+                        </w:txbxContent>
+                      </wps:txbx>
+                      <wps:bodyPr rot="0" spcFirstLastPara="0" vertOverflow="overflow" horzOverflow="overflow" vert="horz" wrap="square" lIns="0" tIns="0" rIns="0" bIns="0" numCol="1" spcCol="0" rtlCol="0" fromWordArt="0" anchor="t" anchorCtr="0" forceAA="0" compatLnSpc="1">
+                        <a:prstTxWarp prst="textNoShape">
+                          <a:avLst/>
+                        </a:prstTxWarp>
+                        <a:spAutoFit/>
+                      </wps:bodyPr>
+                    </wps:wsp>
+                  </a:graphicData>
+                </a:graphic>
+              </wp:anchor>
+            </w:drawing>
+          </mc:Choice>
+          <mc:Fallback>
+            <w:pict>
+              <v:shape w14:anchorId="5C336933" id="Textfeld 1" o:spid="_x0000_s1032" type="#_x0000_t202" style="position:absolute;margin-left:280.4pt;margin-top:216.3pt;width:124.5pt;height:.05pt;z-index:251678720;visibility:visible;mso-wrap-style:square;mso-wrap-distance-left:9pt;mso-wrap-distance-top:0;mso-wrap-distance-right:9pt;mso-wrap-distance-bottom:0;mso-position-horizontal:absolute;mso-position-horizontal-relative:text;mso-position-vertical:absolute;mso-position-vertical-relative:text;v-text-anchor:top" o:gfxdata="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" stroked="f">
+                <v:textbox style="mso-fit-shape-to-text:t" inset="0,0,0,0">
+                  <w:txbxContent>
+                    <w:p>
+                      <w:pPr>
+                        <w:pStyle w:val="Beschriftung"/>
+                      </w:pPr>
+                      <w:r>
+                        <w:t xml:space="preserve">Abbildung </w:t>
+                      </w:r>
+                      <w:fldSimple w:instr=" SEQ Abbildung \* ARABIC ">
+                        <w:r>
+                          <w:rPr>
+                            <w:noProof/>
+                          </w:rPr>
+                          <w:t>2</w:t>
+                        </w:r>
+                      </w:fldSimple>
+                      <w:r>
+                        <w:t xml:space="preserve"> Beschaltung der Anpassung mit Leitungslängen</w:t>
+                      </w:r>
+                    </w:p>
+                  </w:txbxContent>
+                </v:textbox>
+                <w10:wrap type="square"/>
+              </v:shape>
+            </w:pict>
+          </mc:Fallback>
+        </mc:AlternateContent>
+      </w:r>
+      <w:r>
+        <w:drawing>
+          <wp:anchor distT="0" distB="0" distL="114300" distR="114300" simplePos="0" relativeHeight="251676672" behindDoc="0" locked="0" layoutInCell="1" allowOverlap="1" wp14:anchorId="3B7449BC" wp14:editId="6A1934DB">
+            <wp:simplePos x="0" y="0"/>
+            <wp:positionH relativeFrom="column">
+              <wp:posOffset>3586669</wp:posOffset>
+            </wp:positionH>
+            <wp:positionV relativeFrom="paragraph">
+              <wp:posOffset>29706</wp:posOffset>
+            </wp:positionV>
+            <wp:extent cx="1581150" cy="2400300"/>
+            <wp:effectExtent l="0" t="0" r="0" b="0"/>
+            <wp:wrapSquare wrapText="bothSides"/>
+            <wp:docPr id="123260686" name="Grafik 1"/>
+            <wp:cNvGraphicFramePr>
+              <a:graphicFrameLocks xmlns:a="http://schemas.openxmlformats.org/drawingml/2006/main" noChangeAspect="1"/>
+            </wp:cNvGraphicFramePr>
+            <a:graphic xmlns:a="http://schemas.openxmlformats.org/drawingml/2006/main">
+              <a:graphicData uri="http://schemas.openxmlformats.org/drawingml/2006/picture">
+                <pic:pic xmlns:pic="http://schemas.openxmlformats.org/drawingml/2006/picture">
+                  <pic:nvPicPr>
+                    <pic:cNvPr id="123260686" name=""/>
+                    <pic:cNvPicPr/>
+                  </pic:nvPicPr>
+                  <pic:blipFill>
+                    <a:blip r:embed="rId13">
+                      <a:extLst>
+                        <a:ext uri="{28A0092B-C50C-407E-A947-70E740481C1C}">
+                          <a14:useLocalDpi xmlns:a14="http://schemas.microsoft.com/office/drawing/2010/main" val="0"/>
+                        </a:ext>
+                      </a:extLst>
+                    </a:blip>
+                    <a:stretch>
+                      <a:fillRect/>
+                    </a:stretch>
+                  </pic:blipFill>
+                  <pic:spPr>
+                    <a:xfrm>
+                      <a:off x="0" y="0"/>
+                      <a:ext cx="1581150" cy="2400300"/>
+                    </a:xfrm>
+                    <a:prstGeom prst="rect">
+                      <a:avLst/>
+                    </a:prstGeom>
+                  </pic:spPr>
+                </pic:pic>
+              </a:graphicData>
+            </a:graphic>
+            <wp14:sizeRelH relativeFrom="page">
+              <wp14:pctWidth>0</wp14:pctWidth>
+            </wp14:sizeRelH>
+            <wp14:sizeRelV relativeFrom="page">
+              <wp14:pctHeight>0</wp14:pctHeight>
+            </wp14:sizeRelV>
+          </wp:anchor>
+        </w:drawing>
+      </w:r>
+      <w:r>
+        <w:drawing>
+          <wp:inline distT="0" distB="0" distL="0" distR="0" wp14:anchorId="62F14409" wp14:editId="2FCF4398">
+            <wp:extent cx="2755150" cy="2662220"/>
+            <wp:effectExtent l="0" t="0" r="7620" b="5080"/>
+            <wp:docPr id="2045857437" name="Grafik 1"/>
+            <wp:cNvGraphicFramePr>
+              <a:graphicFrameLocks xmlns:a="http://schemas.openxmlformats.org/drawingml/2006/main" noChangeAspect="1"/>
+            </wp:cNvGraphicFramePr>
+            <a:graphic xmlns:a="http://schemas.openxmlformats.org/drawingml/2006/main">
+              <a:graphicData uri="http://schemas.openxmlformats.org/drawingml/2006/picture">
+                <pic:pic xmlns:pic="http://schemas.openxmlformats.org/drawingml/2006/picture">
+                  <pic:nvPicPr>
+                    <pic:cNvPr id="2045857437" name=""/>
+                    <pic:cNvPicPr/>
+                  </pic:nvPicPr>
+                  <pic:blipFill>
+                    <a:blip r:embed="rId14"/>
+                    <a:stretch>
+                      <a:fillRect/>
+                    </a:stretch>
+                  </pic:blipFill>
+                  <pic:spPr>
+                    <a:xfrm>
+                      <a:off x="0" y="0"/>
+                      <a:ext cx="2778660" cy="2684937"/>
+                    </a:xfrm>
+                    <a:prstGeom prst="rect">
+                      <a:avLst/>
+                    </a:prstGeom>
+                  </pic:spPr>
+                </pic:pic>
+              </a:graphicData>
+            </a:graphic>
+          </wp:inline>
+        </w:drawing>
+      </w:r>
+    </w:p>
+    <w:p>
+      <w:pPr>
+        <w:pStyle w:val="Beschriftung"/>
+      </w:pPr>
+      <w:r>
+        <w:t xml:space="preserve">Abbildung </w:t>
+      </w:r>
+      <w:fldSimple w:instr=" SEQ Abbildung \* ARABIC ">
+        <w:r>
+          <w:rPr>
+            <w:noProof/>
+          </w:rPr>
+          <w:t>1</w:t>
+        </w:r>
+      </w:fldSimple>
+      <w:r>
+        <w:t xml:space="preserve"> Smith Chart mit Anpassung von </w:t>
+      </w:r>
+      <w:proofErr w:type="gramStart"/>
+      <w:r>
+        <w:t>S(</w:t>
+      </w:r>
+      <w:proofErr w:type="gramEnd"/>
+      <w:r>
+        <w:t>1,1) an 50Ω</w:t>
+      </w:r>
+    </w:p>
+    <w:p/>
+    <w:p>
+      <w:r>
+        <w:t>Daraus ergeben sich die Längen l</w:t>
+      </w:r>
+      <w:r>
+        <w:t>1</w:t>
+      </w:r>
+      <w:r>
+        <w:t xml:space="preserve"> = 9,8 mm</w:t>
+      </w:r>
+      <w:r>
+        <w:t xml:space="preserve"> und </w:t>
+      </w:r>
+      <w:r>
+        <w:t>l</w:t>
+      </w:r>
+      <w:r>
+        <w:t>2</w:t>
+      </w:r>
+      <w:r>
+        <w:t xml:space="preserve"> = 16,5 mm</w:t>
+      </w:r>
+      <w:r>
+        <w:t>.</w:t>
+      </w:r>
+    </w:p>
+    <w:p>
+      <w:r>
+        <w:br w:type="page"/>
+      </w:r>
+    </w:p>
+    <w:p>
+      <w:pPr>
+        <w:pStyle w:val="berschrift4"/>
+      </w:pPr>
+      <w:r>
+        <w:lastRenderedPageBreak/>
+        <w:t>Längen l</w:t>
+      </w:r>
+      <w:r>
+        <w:t>3</w:t>
+      </w:r>
+      <w:r>
+        <w:t xml:space="preserve"> und l</w:t>
+      </w:r>
+      <w:r>
+        <w:t>4</w:t>
+      </w:r>
+    </w:p>
+    <w:p>
+      <w:r>
+        <w:t xml:space="preserve">Die Anpassung von </w:t>
+      </w:r>
+      <w:proofErr w:type="gramStart"/>
+      <w:r>
+        <w:t>S(</w:t>
+      </w:r>
+      <w:proofErr w:type="gramEnd"/>
+      <w:r>
+        <w:t>2</w:t>
+      </w:r>
+      <w:r>
+        <w:t>,</w:t>
+      </w:r>
+      <w:r>
+        <w:t>2</w:t>
+      </w:r>
+      <w:r>
+        <w:t xml:space="preserve">) </w:t>
+      </w:r>
+      <w:r>
+        <w:t>zu 50Ω</w:t>
+      </w:r>
+      <w:r>
+        <w:t xml:space="preserve"> soll mit einer offenen Stich- und einer Längsleitung umgesetzt werden.</w:t>
+      </w:r>
+    </w:p>
+    <w:p>
+      <w:pPr>
+        <w:keepNext/>
+      </w:pPr>
+      <w:r>
+        <w:rPr>
+          <w:noProof/>
+        </w:rPr>
+        <mc:AlternateContent>
+          <mc:Choice Requires="wps">
+            <w:drawing>
+              <wp:anchor distT="0" distB="0" distL="114300" distR="114300" simplePos="0" relativeHeight="251681792" behindDoc="0" locked="0" layoutInCell="1" allowOverlap="1" wp14:anchorId="627AEFE5" wp14:editId="51F16B08">
+                <wp:simplePos x="0" y="0"/>
+                <wp:positionH relativeFrom="column">
+                  <wp:posOffset>3505835</wp:posOffset>
+                </wp:positionH>
+                <wp:positionV relativeFrom="paragraph">
+                  <wp:posOffset>2727129</wp:posOffset>
+                </wp:positionV>
+                <wp:extent cx="1581150" cy="635"/>
+                <wp:effectExtent l="0" t="0" r="0" b="0"/>
+                <wp:wrapSquare wrapText="bothSides"/>
+                <wp:docPr id="543921113" name="Textfeld 1"/>
+                <wp:cNvGraphicFramePr/>
+                <a:graphic xmlns:a="http://schemas.openxmlformats.org/drawingml/2006/main">
+                  <a:graphicData uri="http://schemas.microsoft.com/office/word/2010/wordprocessingShape">
+                    <wps:wsp>
+                      <wps:cNvSpPr txBox="1"/>
+                      <wps:spPr>
+                        <a:xfrm>
+                          <a:off x="0" y="0"/>
+                          <a:ext cx="1581150" cy="635"/>
+                        </a:xfrm>
+                        <a:prstGeom prst="rect">
+                          <a:avLst/>
+                        </a:prstGeom>
+                        <a:solidFill>
+                          <a:prstClr val="white"/>
+                        </a:solidFill>
+                        <a:ln>
+                          <a:noFill/>
+                        </a:ln>
+                      </wps:spPr>
+                      <wps:txbx>
+                        <w:txbxContent>
+                          <w:p>
+                            <w:pPr>
+                              <w:pStyle w:val="Beschriftung"/>
+                            </w:pPr>
+                            <w:r>
+                              <w:t xml:space="preserve">Abbildung </w:t>
+                            </w:r>
+                            <w:r>
+                              <w:fldChar w:fldCharType="begin"/>
+                            </w:r>
+                            <w:r>
+                              <w:instrText xml:space="preserve"> SEQ Abbildung \* ARABIC </w:instrText>
+                            </w:r>
+                            <w:r>
+                              <w:fldChar w:fldCharType="separate"/>
+                            </w:r>
+                            <w:r>
+                              <w:rPr>
+                                <w:noProof/>
+                              </w:rPr>
+                              <w:t>2</w:t>
+                            </w:r>
+                            <w:r>
+                              <w:fldChar w:fldCharType="end"/>
+                            </w:r>
+                            <w:r>
+                              <w:t xml:space="preserve"> Beschaltung der Anpassung mit Leitungslängen</w:t>
+                            </w:r>
+                          </w:p>
+                        </w:txbxContent>
+                      </wps:txbx>
+                      <wps:bodyPr rot="0" spcFirstLastPara="0" vertOverflow="overflow" horzOverflow="overflow" vert="horz" wrap="square" lIns="0" tIns="0" rIns="0" bIns="0" numCol="1" spcCol="0" rtlCol="0" fromWordArt="0" anchor="t" anchorCtr="0" forceAA="0" compatLnSpc="1">
+                        <a:prstTxWarp prst="textNoShape">
+                          <a:avLst/>
+                        </a:prstTxWarp>
+                        <a:spAutoFit/>
+                      </wps:bodyPr>
+                    </wps:wsp>
+                  </a:graphicData>
+                </a:graphic>
+              </wp:anchor>
+            </w:drawing>
+          </mc:Choice>
+          <mc:Fallback>
+            <w:pict>
+              <v:shape w14:anchorId="627AEFE5" id="_x0000_s1033" type="#_x0000_t202" style="position:absolute;margin-left:276.05pt;margin-top:214.75pt;width:124.5pt;height:.05pt;z-index:251681792;visibility:visible;mso-wrap-style:square;mso-wrap-distance-left:9pt;mso-wrap-distance-top:0;mso-wrap-distance-right:9pt;mso-wrap-distance-bottom:0;mso-position-horizontal:absolute;mso-position-horizontal-relative:text;mso-position-vertical:absolute;mso-position-vertical-relative:text;v-text-anchor:top" o:gfxdata="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" stroked="f">
+                <v:textbox style="mso-fit-shape-to-text:t" inset="0,0,0,0">
+                  <w:txbxContent>
+                    <w:p>
+                      <w:pPr>
+                        <w:pStyle w:val="Beschriftung"/>
+                      </w:pPr>
+                      <w:r>
+                        <w:t xml:space="preserve">Abbildung </w:t>
+                      </w:r>
+                      <w:r>
+                        <w:fldChar w:fldCharType="begin"/>
+                      </w:r>
+                      <w:r>
+                        <w:instrText xml:space="preserve"> SEQ Abbildung \* ARABIC </w:instrText>
+                      </w:r>
+                      <w:r>
+                        <w:fldChar w:fldCharType="separate"/>
+                      </w:r>
+                      <w:r>
+                        <w:rPr>
+                          <w:noProof/>
+                        </w:rPr>
+                        <w:t>2</w:t>
+                      </w:r>
+                      <w:r>
+                        <w:fldChar w:fldCharType="end"/>
+                      </w:r>
+                      <w:r>
+                        <w:t xml:space="preserve"> Beschaltung der Anpassung mit Leitungslängen</w:t>
+                      </w:r>
+                    </w:p>
+                  </w:txbxContent>
+                </v:textbox>
+                <w10:wrap type="square"/>
+              </v:shape>
+            </w:pict>
+          </mc:Fallback>
+        </mc:AlternateContent>
+      </w:r>
+      <w:r>
+        <w:drawing>
+          <wp:anchor distT="0" distB="0" distL="114300" distR="114300" simplePos="0" relativeHeight="251680768" behindDoc="0" locked="0" layoutInCell="1" allowOverlap="1" wp14:anchorId="660EED97" wp14:editId="4C92A230">
+            <wp:simplePos x="0" y="0"/>
+            <wp:positionH relativeFrom="column">
+              <wp:posOffset>3544626</wp:posOffset>
+            </wp:positionH>
+            <wp:positionV relativeFrom="paragraph">
+              <wp:posOffset>-439</wp:posOffset>
+            </wp:positionV>
+            <wp:extent cx="1573530" cy="2400300"/>
+            <wp:effectExtent l="0" t="0" r="7620" b="0"/>
+            <wp:wrapSquare wrapText="bothSides"/>
+            <wp:docPr id="2027873518" name="Grafik 1"/>
+            <wp:cNvGraphicFramePr>
+              <a:graphicFrameLocks xmlns:a="http://schemas.openxmlformats.org/drawingml/2006/main" noChangeAspect="1"/>
+            </wp:cNvGraphicFramePr>
+            <a:graphic xmlns:a="http://schemas.openxmlformats.org/drawingml/2006/main">
+              <a:graphicData uri="http://schemas.openxmlformats.org/drawingml/2006/picture">
+                <pic:pic xmlns:pic="http://schemas.openxmlformats.org/drawingml/2006/picture">
+                  <pic:nvPicPr>
+                    <pic:cNvPr id="2027873518" name="Grafik 1"/>
+                    <pic:cNvPicPr/>
+                  </pic:nvPicPr>
+                  <pic:blipFill>
+                    <a:blip r:embed="rId15">
+                      <a:extLst>
+                        <a:ext uri="{28A0092B-C50C-407E-A947-70E740481C1C}">
+                          <a14:useLocalDpi xmlns:a14="http://schemas.microsoft.com/office/drawing/2010/main" val="0"/>
+                        </a:ext>
+                      </a:extLst>
+                    </a:blip>
+                    <a:stretch>
+                      <a:fillRect/>
+                    </a:stretch>
+                  </pic:blipFill>
+                  <pic:spPr>
+                    <a:xfrm>
+                      <a:off x="0" y="0"/>
+                      <a:ext cx="1573530" cy="2400300"/>
+                    </a:xfrm>
+                    <a:prstGeom prst="rect">
+                      <a:avLst/>
+                    </a:prstGeom>
+                  </pic:spPr>
+                </pic:pic>
+              </a:graphicData>
+            </a:graphic>
+            <wp14:sizeRelH relativeFrom="page">
+              <wp14:pctWidth>0</wp14:pctWidth>
+            </wp14:sizeRelH>
+            <wp14:sizeRelV relativeFrom="page">
+              <wp14:pctHeight>0</wp14:pctHeight>
+            </wp14:sizeRelV>
+          </wp:anchor>
+        </w:drawing>
+      </w:r>
+      <w:r>
+        <w:drawing>
+          <wp:inline distT="0" distB="0" distL="0" distR="0" wp14:anchorId="381C5FB4" wp14:editId="5985CF70">
+            <wp:extent cx="2785279" cy="2682909"/>
+            <wp:effectExtent l="0" t="0" r="0" b="3175"/>
+            <wp:docPr id="898779357" name="Grafik 1"/>
+            <wp:cNvGraphicFramePr>
+              <a:graphicFrameLocks xmlns:a="http://schemas.openxmlformats.org/drawingml/2006/main" noChangeAspect="1"/>
+            </wp:cNvGraphicFramePr>
+            <a:graphic xmlns:a="http://schemas.openxmlformats.org/drawingml/2006/main">
+              <a:graphicData uri="http://schemas.openxmlformats.org/drawingml/2006/picture">
+                <pic:pic xmlns:pic="http://schemas.openxmlformats.org/drawingml/2006/picture">
+                  <pic:nvPicPr>
+                    <pic:cNvPr id="898779357" name="Grafik 1"/>
+                    <pic:cNvPicPr/>
+                  </pic:nvPicPr>
+                  <pic:blipFill>
+                    <a:blip r:embed="rId16" cstate="print">
+                      <a:extLst>
+                        <a:ext uri="{28A0092B-C50C-407E-A947-70E740481C1C}">
+                          <a14:useLocalDpi xmlns:a14="http://schemas.microsoft.com/office/drawing/2010/main" val="0"/>
+                        </a:ext>
+                      </a:extLst>
+                    </a:blip>
+                    <a:stretch>
+                      <a:fillRect/>
+                    </a:stretch>
+                  </pic:blipFill>
+                  <pic:spPr>
+                    <a:xfrm>
+                      <a:off x="0" y="0"/>
+                      <a:ext cx="2792080" cy="2689460"/>
+                    </a:xfrm>
+                    <a:prstGeom prst="rect">
+                      <a:avLst/>
+                    </a:prstGeom>
+                  </pic:spPr>
+                </pic:pic>
+              </a:graphicData>
+            </a:graphic>
+          </wp:inline>
+        </w:drawing>
+      </w:r>
+    </w:p>
+    <w:p>
+      <w:pPr>
+        <w:pStyle w:val="Beschriftung"/>
+      </w:pPr>
+      <w:r>
+        <w:t xml:space="preserve">Abbildung </w:t>
+      </w:r>
+      <w:r>
+        <w:fldChar w:fldCharType="begin"/>
+      </w:r>
+      <w:r>
+        <w:instrText xml:space="preserve"> SEQ Abbildung \* ARABIC </w:instrText>
+      </w:r>
+      <w:r>
+        <w:fldChar w:fldCharType="separate"/>
+      </w:r>
+      <w:r>
+        <w:rPr>
+          <w:noProof/>
+        </w:rPr>
+        <w:t>1</w:t>
+      </w:r>
+      <w:r>
+        <w:fldChar w:fldCharType="end"/>
+      </w:r>
+      <w:r>
+        <w:t xml:space="preserve"> Smith Chart mit Anpassung von </w:t>
+      </w:r>
+      <w:proofErr w:type="gramStart"/>
+      <w:r>
+        <w:t>S(</w:t>
+      </w:r>
+      <w:proofErr w:type="gramEnd"/>
+      <w:r>
+        <w:t>2</w:t>
+      </w:r>
+      <w:r>
+        <w:t>,</w:t>
+      </w:r>
+      <w:r>
+        <w:t>2</w:t>
+      </w:r>
+      <w:r>
+        <w:t>)</w:t>
+      </w:r>
+      <w:r>
+        <w:t xml:space="preserve"> an 50Ω</w:t>
+      </w:r>
+    </w:p>
+    <w:p/>
+    <w:p>
+      <w:r>
+        <w:t>Daraus ergeben sich die Längen l</w:t>
+      </w:r>
+      <w:r>
+        <w:t>3</w:t>
+      </w:r>
+      <w:r>
+        <w:t xml:space="preserve"> = </w:t>
+      </w:r>
+      <w:r>
+        <w:t>8,0</w:t>
+      </w:r>
+      <w:r>
+        <w:t xml:space="preserve"> mm und l</w:t>
+      </w:r>
+      <w:r>
+        <w:t>4</w:t>
+      </w:r>
+      <w:r>
+        <w:t xml:space="preserve"> = </w:t>
+      </w:r>
+      <w:r>
+        <w:t>38,0</w:t>
+      </w:r>
+      <w:r>
+        <w:t xml:space="preserve"> mm.</w:t>
+      </w:r>
+    </w:p>
+    <w:p>
+      <w:pPr>
+        <w:pStyle w:val="berschrift4"/>
+      </w:pPr>
+      <w:r>
+        <w:t>Längen l</w:t>
+      </w:r>
+      <w:r>
+        <w:t>5</w:t>
+      </w:r>
+      <w:r>
+        <w:t xml:space="preserve"> und l</w:t>
+      </w:r>
+      <w:r>
+        <w:t>6</w:t>
+      </w:r>
+    </w:p>
+    <w:p>
+      <w:r>
+        <w:t xml:space="preserve">Die Anpassung von </w:t>
+      </w:r>
+      <w:proofErr w:type="gramStart"/>
+      <w:r>
+        <w:t>S(</w:t>
+      </w:r>
+      <w:proofErr w:type="gramEnd"/>
+      <w:r>
+        <w:t xml:space="preserve">1,1) zum Generator soll mit einer Längs- und einer </w:t>
+      </w:r>
+      <w:r>
+        <w:t>kurzgeschlossenen</w:t>
+      </w:r>
+      <w:r>
+        <w:t xml:space="preserve"> Stichleitung umgesetzt werden.</w:t>
+      </w:r>
+    </w:p>
+    <w:p>
+      <w:pPr>
+        <w:keepNext/>
+      </w:pPr>
+      <w:r>
+        <w:drawing>
+          <wp:anchor distT="0" distB="0" distL="114300" distR="114300" simplePos="0" relativeHeight="251683840" behindDoc="0" locked="0" layoutInCell="1" allowOverlap="1" wp14:anchorId="49FBD5DF" wp14:editId="177F9471">
+            <wp:simplePos x="0" y="0"/>
+            <wp:positionH relativeFrom="column">
+              <wp:posOffset>3505835</wp:posOffset>
+            </wp:positionH>
+            <wp:positionV relativeFrom="paragraph">
+              <wp:posOffset>106045</wp:posOffset>
+            </wp:positionV>
+            <wp:extent cx="1581150" cy="2338070"/>
+            <wp:effectExtent l="0" t="0" r="0" b="5080"/>
+            <wp:wrapSquare wrapText="bothSides"/>
+            <wp:docPr id="1750713152" name="Grafik 1"/>
+            <wp:cNvGraphicFramePr>
+              <a:graphicFrameLocks xmlns:a="http://schemas.openxmlformats.org/drawingml/2006/main" noChangeAspect="1"/>
+            </wp:cNvGraphicFramePr>
+            <a:graphic xmlns:a="http://schemas.openxmlformats.org/drawingml/2006/main">
+              <a:graphicData uri="http://schemas.openxmlformats.org/drawingml/2006/picture">
+                <pic:pic xmlns:pic="http://schemas.openxmlformats.org/drawingml/2006/picture">
+                  <pic:nvPicPr>
+                    <pic:cNvPr id="1750713152" name="Grafik 1"/>
+                    <pic:cNvPicPr/>
+                  </pic:nvPicPr>
+                  <pic:blipFill>
+                    <a:blip r:embed="rId17">
+                      <a:extLst>
+                        <a:ext uri="{28A0092B-C50C-407E-A947-70E740481C1C}">
+                          <a14:useLocalDpi xmlns:a14="http://schemas.microsoft.com/office/drawing/2010/main" val="0"/>
+                        </a:ext>
+                      </a:extLst>
+                    </a:blip>
+                    <a:stretch>
+                      <a:fillRect/>
+                    </a:stretch>
+                  </pic:blipFill>
+                  <pic:spPr>
+                    <a:xfrm>
+                      <a:off x="0" y="0"/>
+                      <a:ext cx="1581150" cy="2338070"/>
+                    </a:xfrm>
+                    <a:prstGeom prst="rect">
+                      <a:avLst/>
+                    </a:prstGeom>
+                  </pic:spPr>
+                </pic:pic>
+              </a:graphicData>
+            </a:graphic>
+            <wp14:sizeRelH relativeFrom="page">
+              <wp14:pctWidth>0</wp14:pctWidth>
+            </wp14:sizeRelH>
+            <wp14:sizeRelV relativeFrom="page">
+              <wp14:pctHeight>0</wp14:pctHeight>
+            </wp14:sizeRelV>
+          </wp:anchor>
+        </w:drawing>
+      </w:r>
+      <w:r>
+        <w:rPr>
+          <w:noProof/>
+        </w:rPr>
+        <mc:AlternateContent>
+          <mc:Choice Requires="wps">
+            <w:drawing>
+              <wp:anchor distT="0" distB="0" distL="114300" distR="114300" simplePos="0" relativeHeight="251684864" behindDoc="0" locked="0" layoutInCell="1" allowOverlap="1" wp14:anchorId="505DBE96" wp14:editId="06955A62">
+                <wp:simplePos x="0" y="0"/>
+                <wp:positionH relativeFrom="column">
+                  <wp:posOffset>3475690</wp:posOffset>
+                </wp:positionH>
+                <wp:positionV relativeFrom="paragraph">
+                  <wp:posOffset>2782396</wp:posOffset>
+                </wp:positionV>
+                <wp:extent cx="1581150" cy="635"/>
+                <wp:effectExtent l="0" t="0" r="0" b="0"/>
+                <wp:wrapSquare wrapText="bothSides"/>
+                <wp:docPr id="145318456" name="Textfeld 1"/>
+                <wp:cNvGraphicFramePr/>
+                <a:graphic xmlns:a="http://schemas.openxmlformats.org/drawingml/2006/main">
+                  <a:graphicData uri="http://schemas.microsoft.com/office/word/2010/wordprocessingShape">
+                    <wps:wsp>
+                      <wps:cNvSpPr txBox="1"/>
+                      <wps:spPr>
+                        <a:xfrm>
+                          <a:off x="0" y="0"/>
+                          <a:ext cx="1581150" cy="635"/>
+                        </a:xfrm>
+                        <a:prstGeom prst="rect">
+                          <a:avLst/>
+                        </a:prstGeom>
+                        <a:solidFill>
+                          <a:prstClr val="white"/>
+                        </a:solidFill>
+                        <a:ln>
+                          <a:noFill/>
+                        </a:ln>
+                      </wps:spPr>
+                      <wps:txbx>
+                        <w:txbxContent>
+                          <w:p>
+                            <w:pPr>
+                              <w:pStyle w:val="Beschriftung"/>
+                            </w:pPr>
+                            <w:r>
+                              <w:t xml:space="preserve">Abbildung </w:t>
+                            </w:r>
+                            <w:r>
+                              <w:fldChar w:fldCharType="begin"/>
+                            </w:r>
+                            <w:r>
+                              <w:instrText xml:space="preserve"> SEQ Abbildung \* ARABIC </w:instrText>
+                            </w:r>
+                            <w:r>
+                              <w:fldChar w:fldCharType="separate"/>
+                            </w:r>
+                            <w:r>
+                              <w:rPr>
+                                <w:noProof/>
+                              </w:rPr>
+                              <w:t>2</w:t>
+                            </w:r>
+                            <w:r>
+                              <w:fldChar w:fldCharType="end"/>
+                            </w:r>
+                            <w:r>
+                              <w:t xml:space="preserve"> Beschaltung der Anpassung mit Leitungslängen</w:t>
+                            </w:r>
+                          </w:p>
+                        </w:txbxContent>
+                      </wps:txbx>
+                      <wps:bodyPr rot="0" spcFirstLastPara="0" vertOverflow="overflow" horzOverflow="overflow" vert="horz" wrap="square" lIns="0" tIns="0" rIns="0" bIns="0" numCol="1" spcCol="0" rtlCol="0" fromWordArt="0" anchor="t" anchorCtr="0" forceAA="0" compatLnSpc="1">
+                        <a:prstTxWarp prst="textNoShape">
+                          <a:avLst/>
+                        </a:prstTxWarp>
+                        <a:spAutoFit/>
+                      </wps:bodyPr>
+                    </wps:wsp>
+                  </a:graphicData>
+                </a:graphic>
+              </wp:anchor>
+            </w:drawing>
+          </mc:Choice>
+          <mc:Fallback>
+            <w:pict>
+              <v:shape w14:anchorId="505DBE96" id="_x0000_s1034" type="#_x0000_t202" style="position:absolute;margin-left:273.7pt;margin-top:219.1pt;width:124.5pt;height:.05pt;z-index:251684864;visibility:visible;mso-wrap-style:square;mso-wrap-distance-left:9pt;mso-wrap-distance-top:0;mso-wrap-distance-right:9pt;mso-wrap-distance-bottom:0;mso-position-horizontal:absolute;mso-position-horizontal-relative:text;mso-position-vertical:absolute;mso-position-vertical-relative:text;v-text-anchor:top" o:gfxdata="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" stroked="f">
+                <v:textbox style="mso-fit-shape-to-text:t" inset="0,0,0,0">
+                  <w:txbxContent>
+                    <w:p>
+                      <w:pPr>
+                        <w:pStyle w:val="Beschriftung"/>
+                      </w:pPr>
+                      <w:r>
+                        <w:t xml:space="preserve">Abbildung </w:t>
+                      </w:r>
+                      <w:r>
+                        <w:fldChar w:fldCharType="begin"/>
+                      </w:r>
+                      <w:r>
+                        <w:instrText xml:space="preserve"> SEQ Abbildung \* ARABIC </w:instrText>
+                      </w:r>
+                      <w:r>
+                        <w:fldChar w:fldCharType="separate"/>
+                      </w:r>
+                      <w:r>
+                        <w:rPr>
+                          <w:noProof/>
+                        </w:rPr>
+                        <w:t>2</w:t>
+                      </w:r>
+                      <w:r>
+                        <w:fldChar w:fldCharType="end"/>
+                      </w:r>
+                      <w:r>
+                        <w:t xml:space="preserve"> Beschaltung der Anpassung mit Leitungslängen</w:t>
+                      </w:r>
+                    </w:p>
+                  </w:txbxContent>
+                </v:textbox>
+                <w10:wrap type="square"/>
+              </v:shape>
+            </w:pict>
+          </mc:Fallback>
+        </mc:AlternateContent>
+      </w:r>
+      <w:r>
+        <w:drawing>
+          <wp:inline distT="0" distB="0" distL="0" distR="0" wp14:anchorId="4A28CA2C" wp14:editId="02DCD313">
+            <wp:extent cx="2822433" cy="2681843"/>
+            <wp:effectExtent l="0" t="0" r="0" b="4445"/>
+            <wp:docPr id="2117909203" name="Grafik 1"/>
+            <wp:cNvGraphicFramePr>
+              <a:graphicFrameLocks xmlns:a="http://schemas.openxmlformats.org/drawingml/2006/main" noChangeAspect="1"/>
+            </wp:cNvGraphicFramePr>
+            <a:graphic xmlns:a="http://schemas.openxmlformats.org/drawingml/2006/main">
+              <a:graphicData uri="http://schemas.openxmlformats.org/drawingml/2006/picture">
+                <pic:pic xmlns:pic="http://schemas.openxmlformats.org/drawingml/2006/picture">
+                  <pic:nvPicPr>
+                    <pic:cNvPr id="2117909203" name="Grafik 1"/>
+                    <pic:cNvPicPr/>
+                  </pic:nvPicPr>
+                  <pic:blipFill>
+                    <a:blip r:embed="rId18" cstate="print">
+                      <a:extLst>
+                        <a:ext uri="{28A0092B-C50C-407E-A947-70E740481C1C}">
+                          <a14:useLocalDpi xmlns:a14="http://schemas.microsoft.com/office/drawing/2010/main" val="0"/>
+                        </a:ext>
+                      </a:extLst>
+                    </a:blip>
+                    <a:stretch>
+                      <a:fillRect/>
+                    </a:stretch>
+                  </pic:blipFill>
+                  <pic:spPr>
+                    <a:xfrm>
+                      <a:off x="0" y="0"/>
+                      <a:ext cx="2822433" cy="2681843"/>
+                    </a:xfrm>
+                    <a:prstGeom prst="rect">
+                      <a:avLst/>
+                    </a:prstGeom>
+                  </pic:spPr>
+                </pic:pic>
+              </a:graphicData>
+            </a:graphic>
+          </wp:inline>
+        </w:drawing>
+      </w:r>
+    </w:p>
+    <w:p>
+      <w:pPr>
+        <w:pStyle w:val="Beschriftung"/>
+      </w:pPr>
+      <w:r>
+        <w:t xml:space="preserve">Abbildung </w:t>
+      </w:r>
+      <w:r>
+        <w:fldChar w:fldCharType="begin"/>
+      </w:r>
+      <w:r>
+        <w:instrText xml:space="preserve"> SEQ Abbildung \* ARABIC </w:instrText>
+      </w:r>
+      <w:r>
+        <w:fldChar w:fldCharType="separate"/>
+      </w:r>
+      <w:r>
+        <w:rPr>
+          <w:noProof/>
+        </w:rPr>
+        <w:t>1</w:t>
+      </w:r>
+      <w:r>
+        <w:fldChar w:fldCharType="end"/>
+      </w:r>
+      <w:r>
+        <w:t xml:space="preserve"> Smith Chart mit Anpassung von </w:t>
+      </w:r>
+      <w:proofErr w:type="gramStart"/>
+      <w:r>
+        <w:t>S(</w:t>
+      </w:r>
+      <w:proofErr w:type="gramEnd"/>
+      <w:r>
+        <w:t>1,1) an 50Ω</w:t>
+      </w:r>
+    </w:p>
+    <w:p/>
+    <w:p>
+      <w:r>
+        <w:t>Daraus ergeben sich die Längen l</w:t>
+      </w:r>
+      <w:r>
+        <w:t>5</w:t>
+      </w:r>
+      <w:r>
+        <w:t xml:space="preserve"> = </w:t>
+      </w:r>
+      <w:r>
+        <w:t>15,7</w:t>
+      </w:r>
+      <w:r>
+        <w:t xml:space="preserve"> mm und l</w:t>
+      </w:r>
+      <w:r>
+        <w:t>6</w:t>
+      </w:r>
+      <w:r>
+        <w:t xml:space="preserve"> = </w:t>
+      </w:r>
+      <w:r>
+        <w:t>47,3</w:t>
+      </w:r>
+      <w:r>
+        <w:t xml:space="preserve"> mm.</w:t>
+      </w:r>
+    </w:p>
+    <w:p>
+      <w:pPr>
+        <w:pStyle w:val="berschrift4"/>
+      </w:pPr>
+      <w:r>
+        <w:lastRenderedPageBreak/>
+        <w:t>Längen l</w:t>
+      </w:r>
+      <w:r>
+        <w:t>7</w:t>
+      </w:r>
+      <w:r>
+        <w:t xml:space="preserve"> und l</w:t>
+      </w:r>
+      <w:r>
+        <w:t>8</w:t>
+      </w:r>
+    </w:p>
+    <w:p>
+      <w:r>
+        <w:t xml:space="preserve">Die Anpassung von </w:t>
+      </w:r>
+      <w:proofErr w:type="gramStart"/>
+      <w:r>
+        <w:t>S(</w:t>
+      </w:r>
+      <w:proofErr w:type="gramEnd"/>
+      <w:r>
+        <w:t xml:space="preserve">2,2) zu 50Ω soll mit einer </w:t>
+      </w:r>
+      <w:r>
+        <w:t>kurzgeschlossenen</w:t>
+      </w:r>
+      <w:r>
+        <w:t xml:space="preserve"> Stich- und einer Längsleitung umgesetzt werden.</w:t>
+      </w:r>
+    </w:p>
+    <w:p>
+      <w:pPr>
+        <w:keepNext/>
+      </w:pPr>
+      <w:r>
+        <w:drawing>
+          <wp:anchor distT="0" distB="0" distL="114300" distR="114300" simplePos="0" relativeHeight="251686912" behindDoc="0" locked="0" layoutInCell="1" allowOverlap="1" wp14:anchorId="58C052B3" wp14:editId="7088AD52">
+            <wp:simplePos x="0" y="0"/>
+            <wp:positionH relativeFrom="column">
+              <wp:posOffset>3546475</wp:posOffset>
+            </wp:positionH>
+            <wp:positionV relativeFrom="paragraph">
+              <wp:posOffset>6985</wp:posOffset>
+            </wp:positionV>
+            <wp:extent cx="1573530" cy="2384425"/>
+            <wp:effectExtent l="0" t="0" r="7620" b="0"/>
+            <wp:wrapSquare wrapText="bothSides"/>
+            <wp:docPr id="1526236327" name="Grafik 1"/>
+            <wp:cNvGraphicFramePr>
+              <a:graphicFrameLocks xmlns:a="http://schemas.openxmlformats.org/drawingml/2006/main" noChangeAspect="1"/>
+            </wp:cNvGraphicFramePr>
+            <a:graphic xmlns:a="http://schemas.openxmlformats.org/drawingml/2006/main">
+              <a:graphicData uri="http://schemas.openxmlformats.org/drawingml/2006/picture">
+                <pic:pic xmlns:pic="http://schemas.openxmlformats.org/drawingml/2006/picture">
+                  <pic:nvPicPr>
+                    <pic:cNvPr id="1526236327" name="Grafik 1"/>
+                    <pic:cNvPicPr/>
+                  </pic:nvPicPr>
+                  <pic:blipFill>
+                    <a:blip r:embed="rId19">
+                      <a:extLst>
+                        <a:ext uri="{28A0092B-C50C-407E-A947-70E740481C1C}">
+                          <a14:useLocalDpi xmlns:a14="http://schemas.microsoft.com/office/drawing/2010/main" val="0"/>
+                        </a:ext>
+                      </a:extLst>
+                    </a:blip>
+                    <a:stretch>
+                      <a:fillRect/>
+                    </a:stretch>
+                  </pic:blipFill>
+                  <pic:spPr>
+                    <a:xfrm>
+                      <a:off x="0" y="0"/>
+                      <a:ext cx="1573530" cy="2384425"/>
+                    </a:xfrm>
+                    <a:prstGeom prst="rect">
+                      <a:avLst/>
+                    </a:prstGeom>
+                  </pic:spPr>
+                </pic:pic>
+              </a:graphicData>
+            </a:graphic>
+            <wp14:sizeRelH relativeFrom="page">
+              <wp14:pctWidth>0</wp14:pctWidth>
+            </wp14:sizeRelH>
+            <wp14:sizeRelV relativeFrom="page">
+              <wp14:pctHeight>0</wp14:pctHeight>
+            </wp14:sizeRelV>
+          </wp:anchor>
+        </w:drawing>
+      </w:r>
+      <w:r>
+        <w:rPr>
+          <w:noProof/>
+        </w:rPr>
+        <mc:AlternateContent>
+          <mc:Choice Requires="wps">
+            <w:drawing>
+              <wp:anchor distT="0" distB="0" distL="114300" distR="114300" simplePos="0" relativeHeight="251687936" behindDoc="0" locked="0" layoutInCell="1" allowOverlap="1" wp14:anchorId="764A5E46" wp14:editId="508B3DA9">
+                <wp:simplePos x="0" y="0"/>
+                <wp:positionH relativeFrom="column">
+                  <wp:posOffset>3505835</wp:posOffset>
+                </wp:positionH>
+                <wp:positionV relativeFrom="paragraph">
+                  <wp:posOffset>2727129</wp:posOffset>
+                </wp:positionV>
+                <wp:extent cx="1581150" cy="635"/>
+                <wp:effectExtent l="0" t="0" r="0" b="0"/>
+                <wp:wrapSquare wrapText="bothSides"/>
+                <wp:docPr id="1803043006" name="Textfeld 1"/>
+                <wp:cNvGraphicFramePr/>
+                <a:graphic xmlns:a="http://schemas.openxmlformats.org/drawingml/2006/main">
+                  <a:graphicData uri="http://schemas.microsoft.com/office/word/2010/wordprocessingShape">
+                    <wps:wsp>
+                      <wps:cNvSpPr txBox="1"/>
+                      <wps:spPr>
+                        <a:xfrm>
+                          <a:off x="0" y="0"/>
+                          <a:ext cx="1581150" cy="635"/>
+                        </a:xfrm>
+                        <a:prstGeom prst="rect">
+                          <a:avLst/>
+                        </a:prstGeom>
+                        <a:solidFill>
+                          <a:prstClr val="white"/>
+                        </a:solidFill>
+                        <a:ln>
+                          <a:noFill/>
+                        </a:ln>
+                      </wps:spPr>
+                      <wps:txbx>
+                        <w:txbxContent>
+                          <w:p>
+                            <w:pPr>
+                              <w:pStyle w:val="Beschriftung"/>
+                            </w:pPr>
+                            <w:r>
+                              <w:t xml:space="preserve">Abbildung </w:t>
+                            </w:r>
+                            <w:r>
+                              <w:fldChar w:fldCharType="begin"/>
+                            </w:r>
+                            <w:r>
+                              <w:instrText xml:space="preserve"> SEQ Abbildung \* ARABIC </w:instrText>
+                            </w:r>
+                            <w:r>
+                              <w:fldChar w:fldCharType="separate"/>
+                            </w:r>
+                            <w:r>
+                              <w:rPr>
+                                <w:noProof/>
+                              </w:rPr>
+                              <w:t>2</w:t>
+                            </w:r>
+                            <w:r>
+                              <w:fldChar w:fldCharType="end"/>
+                            </w:r>
+                            <w:r>
+                              <w:t xml:space="preserve"> Beschaltung der Anpassung mit Leitungslängen</w:t>
+                            </w:r>
+                          </w:p>
+                        </w:txbxContent>
+                      </wps:txbx>
+                      <wps:bodyPr rot="0" spcFirstLastPara="0" vertOverflow="overflow" horzOverflow="overflow" vert="horz" wrap="square" lIns="0" tIns="0" rIns="0" bIns="0" numCol="1" spcCol="0" rtlCol="0" fromWordArt="0" anchor="t" anchorCtr="0" forceAA="0" compatLnSpc="1">
+                        <a:prstTxWarp prst="textNoShape">
+                          <a:avLst/>
+                        </a:prstTxWarp>
+                        <a:spAutoFit/>
+                      </wps:bodyPr>
+                    </wps:wsp>
+                  </a:graphicData>
+                </a:graphic>
+              </wp:anchor>
+            </w:drawing>
+          </mc:Choice>
+          <mc:Fallback>
+            <w:pict>
+              <v:shape w14:anchorId="764A5E46" id="_x0000_s1035" type="#_x0000_t202" style="position:absolute;margin-left:276.05pt;margin-top:214.75pt;width:124.5pt;height:.05pt;z-index:251687936;visibility:visible;mso-wrap-style:square;mso-wrap-distance-left:9pt;mso-wrap-distance-top:0;mso-wrap-distance-right:9pt;mso-wrap-distance-bottom:0;mso-position-horizontal:absolute;mso-position-horizontal-relative:text;mso-position-vertical:absolute;mso-position-vertical-relative:text;v-text-anchor:top" o:gfxdata="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" stroked="f">
+                <v:textbox style="mso-fit-shape-to-text:t" inset="0,0,0,0">
+                  <w:txbxContent>
+                    <w:p>
+                      <w:pPr>
+                        <w:pStyle w:val="Beschriftung"/>
+                      </w:pPr>
+                      <w:r>
+                        <w:t xml:space="preserve">Abbildung </w:t>
+                      </w:r>
+                      <w:r>
+                        <w:fldChar w:fldCharType="begin"/>
+                      </w:r>
+                      <w:r>
+                        <w:instrText xml:space="preserve"> SEQ Abbildung \* ARABIC </w:instrText>
+                      </w:r>
+                      <w:r>
+                        <w:fldChar w:fldCharType="separate"/>
+                      </w:r>
+                      <w:r>
+                        <w:rPr>
+                          <w:noProof/>
+                        </w:rPr>
+                        <w:t>2</w:t>
+                      </w:r>
+                      <w:r>
+                        <w:fldChar w:fldCharType="end"/>
+                      </w:r>
+                      <w:r>
+                        <w:t xml:space="preserve"> Beschaltung der Anpassung mit Leitungslängen</w:t>
+                      </w:r>
+                    </w:p>
+                  </w:txbxContent>
+                </v:textbox>
+                <w10:wrap type="square"/>
+              </v:shape>
+            </w:pict>
+          </mc:Fallback>
+        </mc:AlternateContent>
+      </w:r>
+      <w:r>
+        <w:drawing>
+          <wp:inline distT="0" distB="0" distL="0" distR="0" wp14:anchorId="39F6E2CA" wp14:editId="72C4CC41">
+            <wp:extent cx="2781316" cy="2689460"/>
+            <wp:effectExtent l="0" t="0" r="0" b="0"/>
+            <wp:docPr id="692277124" name="Grafik 1"/>
+            <wp:cNvGraphicFramePr>
+              <a:graphicFrameLocks xmlns:a="http://schemas.openxmlformats.org/drawingml/2006/main" noChangeAspect="1"/>
+            </wp:cNvGraphicFramePr>
+            <a:graphic xmlns:a="http://schemas.openxmlformats.org/drawingml/2006/main">
+              <a:graphicData uri="http://schemas.openxmlformats.org/drawingml/2006/picture">
+                <pic:pic xmlns:pic="http://schemas.openxmlformats.org/drawingml/2006/picture">
+                  <pic:nvPicPr>
+                    <pic:cNvPr id="692277124" name="Grafik 1"/>
+                    <pic:cNvPicPr/>
+                  </pic:nvPicPr>
+                  <pic:blipFill>
+                    <a:blip r:embed="rId20" cstate="print">
+                      <a:extLst>
+                        <a:ext uri="{28A0092B-C50C-407E-A947-70E740481C1C}">
+                          <a14:useLocalDpi xmlns:a14="http://schemas.microsoft.com/office/drawing/2010/main" val="0"/>
+                        </a:ext>
+                      </a:extLst>
+                    </a:blip>
+                    <a:stretch>
+                      <a:fillRect/>
+                    </a:stretch>
+                  </pic:blipFill>
+                  <pic:spPr>
+                    <a:xfrm>
+                      <a:off x="0" y="0"/>
+                      <a:ext cx="2781316" cy="2689460"/>
+                    </a:xfrm>
+                    <a:prstGeom prst="rect">
+                      <a:avLst/>
+                    </a:prstGeom>
+                  </pic:spPr>
+                </pic:pic>
+              </a:graphicData>
+            </a:graphic>
+          </wp:inline>
+        </w:drawing>
+      </w:r>
+    </w:p>
+    <w:p>
+      <w:pPr>
+        <w:pStyle w:val="Beschriftung"/>
+      </w:pPr>
+      <w:r>
+        <w:t xml:space="preserve">Abbildung </w:t>
+      </w:r>
+      <w:r>
+        <w:fldChar w:fldCharType="begin"/>
+      </w:r>
+      <w:r>
+        <w:instrText xml:space="preserve"> SEQ Abbildung \* ARABIC </w:instrText>
+      </w:r>
+      <w:r>
+        <w:fldChar w:fldCharType="separate"/>
+      </w:r>
+      <w:r>
+        <w:rPr>
+          <w:noProof/>
+        </w:rPr>
+        <w:t>1</w:t>
+      </w:r>
+      <w:r>
+        <w:fldChar w:fldCharType="end"/>
+      </w:r>
+      <w:r>
+        <w:t xml:space="preserve"> Smith Chart mit Anpassung von </w:t>
+      </w:r>
+      <w:proofErr w:type="gramStart"/>
+      <w:r>
+        <w:t>S(</w:t>
+      </w:r>
+      <w:proofErr w:type="gramEnd"/>
+      <w:r>
+        <w:t>2,2) an 50Ω</w:t>
+      </w:r>
+    </w:p>
+    <w:p/>
+    <w:p>
+      <w:r>
+        <w:t>Daraus ergeben sich die Längen l</w:t>
+      </w:r>
+      <w:r>
+        <w:t>7</w:t>
+      </w:r>
+      <w:r>
+        <w:t xml:space="preserve"> = </w:t>
+      </w:r>
+      <w:r>
+        <w:t>8,0</w:t>
+      </w:r>
+      <w:r>
+        <w:t xml:space="preserve"> mm und l</w:t>
+      </w:r>
+      <w:r>
+        <w:t>8</w:t>
+      </w:r>
+      <w:r>
+        <w:t xml:space="preserve"> = 1</w:t>
+      </w:r>
+      <w:r>
+        <w:t>2,6</w:t>
+      </w:r>
+      <w:r>
+        <w:t xml:space="preserve"> mm.</w:t>
+      </w:r>
+    </w:p>
+    <w:p>
+      <w:pPr>
+        <w:pStyle w:val="berschrift4"/>
+      </w:pPr>
+      <w:r>
+        <w:t>Übersicht der ermittelten Längen</w:t>
+      </w:r>
+    </w:p>
+    <w:p>
+      <w:pPr>
+        <w:spacing w:after="0"/>
+      </w:pPr>
+      <w:r>
+        <w:t xml:space="preserve">l1 </w:t>
+      </w:r>
+      <w:r>
+        <w:t>= 9,8 mm</w:t>
+      </w:r>
+    </w:p>
+    <w:p>
+      <w:pPr>
+        <w:spacing w:after="0"/>
+      </w:pPr>
+      <w:r>
+        <w:t>l2</w:t>
+      </w:r>
+      <w:r>
+        <w:t xml:space="preserve"> </w:t>
+      </w:r>
+      <w:r>
+        <w:t>= 16,5 mm</w:t>
+      </w:r>
+    </w:p>
+    <w:p>
+      <w:pPr>
+        <w:spacing w:after="0"/>
+      </w:pPr>
+      <w:r>
+        <w:t xml:space="preserve">l3 </w:t>
+      </w:r>
+      <w:r>
+        <w:t xml:space="preserve">= </w:t>
+      </w:r>
+      <w:r>
+        <w:t>8,0</w:t>
+      </w:r>
+      <w:r>
+        <w:t xml:space="preserve"> mm</w:t>
+      </w:r>
+    </w:p>
+    <w:p>
+      <w:pPr>
+        <w:spacing w:after="0"/>
+      </w:pPr>
+      <w:r>
+        <w:t xml:space="preserve">l4 </w:t>
+      </w:r>
+      <w:r>
+        <w:t xml:space="preserve">= </w:t>
+      </w:r>
+      <w:r>
+        <w:t>38,0</w:t>
+      </w:r>
+      <w:r>
+        <w:t xml:space="preserve"> mm</w:t>
+      </w:r>
+    </w:p>
+    <w:p>
+      <w:pPr>
+        <w:spacing w:after="0"/>
+      </w:pPr>
+      <w:r>
+        <w:t xml:space="preserve">l5 </w:t>
+      </w:r>
+      <w:r>
+        <w:t>= 15,7 mm</w:t>
+      </w:r>
+    </w:p>
+    <w:p>
+      <w:pPr>
+        <w:spacing w:after="0"/>
+      </w:pPr>
+      <w:r>
+        <w:t xml:space="preserve">l6 = </w:t>
+      </w:r>
+      <w:r>
+        <w:t>47,3 mm</w:t>
+      </w:r>
+    </w:p>
+    <w:p>
+      <w:pPr>
+        <w:spacing w:after="0"/>
+      </w:pPr>
+      <w:r>
+        <w:t>l7 = 8,0 mm</w:t>
+      </w:r>
+    </w:p>
+    <w:p>
+      <w:pPr>
+        <w:spacing w:after="0"/>
+      </w:pPr>
+      <w:r>
+        <w:t>l8 = 12,6 mm</w:t>
+      </w:r>
     </w:p>
     <w:sectPr>
-      <w:headerReference w:type="default" r:id="rId8"/>
-      <w:footerReference w:type="default" r:id="rId9"/>
+      <w:headerReference w:type="default" r:id="rId21"/>
+      <w:footerReference w:type="default" r:id="rId22"/>
       <w:pgSz w:w="11906" w:h="16838"/>
       <w:pgMar w:top="1417" w:right="1417" w:bottom="1134" w:left="1417" w:header="567" w:footer="624" w:gutter="0"/>
       <w:cols w:space="708"/>
@@ -294,6 +3475,119 @@
     </w:lvl>
   </w:abstractNum>
   <w:abstractNum w:abstractNumId="1" w15:restartNumberingAfterBreak="0">
+    <w:nsid w:val="45A919C5"/>
+    <w:multiLevelType w:val="hybridMultilevel"/>
+    <w:tmpl w:val="63DED8EC"/>
+    <w:lvl w:ilvl="0" w:tplc="2ED0330A">
+      <w:start w:val="4"/>
+      <w:numFmt w:val="bullet"/>
+      <w:lvlText w:val="-"/>
+      <w:lvlJc w:val="left"/>
+      <w:pPr>
+        <w:ind w:left="720" w:hanging="360"/>
+      </w:pPr>
+      <w:rPr>
+        <w:rFonts w:ascii="Aptos" w:eastAsiaTheme="minorHAnsi" w:hAnsi="Aptos" w:cstheme="minorBidi" w:hint="default"/>
+      </w:rPr>
+    </w:lvl>
+    <w:lvl w:ilvl="1" w:tplc="04070003" w:tentative="1">
+      <w:start w:val="1"/>
+      <w:numFmt w:val="bullet"/>
+      <w:lvlText w:val="o"/>
+      <w:lvlJc w:val="left"/>
+      <w:pPr>
+        <w:ind w:left="1440" w:hanging="360"/>
+      </w:pPr>
+      <w:rPr>
+        <w:rFonts w:ascii="Courier New" w:hAnsi="Courier New" w:cs="Courier New" w:hint="default"/>
+      </w:rPr>
+    </w:lvl>
+    <w:lvl w:ilvl="2" w:tplc="04070005" w:tentative="1">
+      <w:start w:val="1"/>
+      <w:numFmt w:val="bullet"/>
+      <w:lvlText w:val=""/>
+      <w:lvlJc w:val="left"/>
+      <w:pPr>
+        <w:ind w:left="2160" w:hanging="360"/>
+      </w:pPr>
+      <w:rPr>
+        <w:rFonts w:ascii="Wingdings" w:hAnsi="Wingdings" w:hint="default"/>
+      </w:rPr>
+    </w:lvl>
+    <w:lvl w:ilvl="3" w:tplc="04070001" w:tentative="1">
+      <w:start w:val="1"/>
+      <w:numFmt w:val="bullet"/>
+      <w:lvlText w:val=""/>
+      <w:lvlJc w:val="left"/>
+      <w:pPr>
+        <w:ind w:left="2880" w:hanging="360"/>
+      </w:pPr>
+      <w:rPr>
+        <w:rFonts w:ascii="Symbol" w:hAnsi="Symbol" w:hint="default"/>
+      </w:rPr>
+    </w:lvl>
+    <w:lvl w:ilvl="4" w:tplc="04070003" w:tentative="1">
+      <w:start w:val="1"/>
+      <w:numFmt w:val="bullet"/>
+      <w:lvlText w:val="o"/>
+      <w:lvlJc w:val="left"/>
+      <w:pPr>
+        <w:ind w:left="3600" w:hanging="360"/>
+      </w:pPr>
+      <w:rPr>
+        <w:rFonts w:ascii="Courier New" w:hAnsi="Courier New" w:cs="Courier New" w:hint="default"/>
+      </w:rPr>
+    </w:lvl>
+    <w:lvl w:ilvl="5" w:tplc="04070005" w:tentative="1">
+      <w:start w:val="1"/>
+      <w:numFmt w:val="bullet"/>
+      <w:lvlText w:val=""/>
+      <w:lvlJc w:val="left"/>
+      <w:pPr>
+        <w:ind w:left="4320" w:hanging="360"/>
+      </w:pPr>
+      <w:rPr>
+        <w:rFonts w:ascii="Wingdings" w:hAnsi="Wingdings" w:hint="default"/>
+      </w:rPr>
+    </w:lvl>
+    <w:lvl w:ilvl="6" w:tplc="04070001" w:tentative="1">
+      <w:start w:val="1"/>
+      <w:numFmt w:val="bullet"/>
+      <w:lvlText w:val=""/>
+      <w:lvlJc w:val="left"/>
+      <w:pPr>
+        <w:ind w:left="5040" w:hanging="360"/>
+      </w:pPr>
+      <w:rPr>
+        <w:rFonts w:ascii="Symbol" w:hAnsi="Symbol" w:hint="default"/>
+      </w:rPr>
+    </w:lvl>
+    <w:lvl w:ilvl="7" w:tplc="04070003" w:tentative="1">
+      <w:start w:val="1"/>
+      <w:numFmt w:val="bullet"/>
+      <w:lvlText w:val="o"/>
+      <w:lvlJc w:val="left"/>
+      <w:pPr>
+        <w:ind w:left="5760" w:hanging="360"/>
+      </w:pPr>
+      <w:rPr>
+        <w:rFonts w:ascii="Courier New" w:hAnsi="Courier New" w:cs="Courier New" w:hint="default"/>
+      </w:rPr>
+    </w:lvl>
+    <w:lvl w:ilvl="8" w:tplc="04070005" w:tentative="1">
+      <w:start w:val="1"/>
+      <w:numFmt w:val="bullet"/>
+      <w:lvlText w:val=""/>
+      <w:lvlJc w:val="left"/>
+      <w:pPr>
+        <w:ind w:left="6480" w:hanging="360"/>
+      </w:pPr>
+      <w:rPr>
+        <w:rFonts w:ascii="Wingdings" w:hAnsi="Wingdings" w:hint="default"/>
+      </w:rPr>
+    </w:lvl>
+  </w:abstractNum>
+  <w:abstractNum w:abstractNumId="2" w15:restartNumberingAfterBreak="0">
     <w:nsid w:val="4AC401F4"/>
     <w:multiLevelType w:val="hybridMultilevel"/>
     <w:tmpl w:val="295E77A2"/>
@@ -382,7 +3676,7 @@
       </w:pPr>
     </w:lvl>
   </w:abstractNum>
-  <w:abstractNum w:abstractNumId="2" w15:restartNumberingAfterBreak="0">
+  <w:abstractNum w:abstractNumId="3" w15:restartNumberingAfterBreak="0">
     <w:nsid w:val="704F6651"/>
     <w:multiLevelType w:val="hybridMultilevel"/>
     <w:tmpl w:val="5F84A626"/>
@@ -475,10 +3769,13 @@
     <w:abstractNumId w:val="0"/>
   </w:num>
   <w:num w:numId="2" w16cid:durableId="41290148">
-    <w:abstractNumId w:val="1"/>
+    <w:abstractNumId w:val="2"/>
   </w:num>
   <w:num w:numId="3" w16cid:durableId="1596816736">
-    <w:abstractNumId w:val="2"/>
+    <w:abstractNumId w:val="3"/>
+  </w:num>
+  <w:num w:numId="4" w16cid:durableId="1812558021">
+    <w:abstractNumId w:val="1"/>
   </w:num>
 </w:numbering>
 </file>
@@ -883,6 +4180,7 @@
   <w:style w:type="paragraph" w:default="1" w:styleId="Standard">
     <w:name w:val="Normal"/>
     <w:qFormat/>
+    <w:rsid w:val="00983239"/>
   </w:style>
   <w:style w:type="paragraph" w:styleId="berschrift1">
     <w:name w:val="heading 1"/>
@@ -933,7 +4231,6 @@
     <w:next w:val="Standard"/>
     <w:link w:val="berschrift3Zchn"/>
     <w:uiPriority w:val="9"/>
-    <w:semiHidden/>
     <w:unhideWhenUsed/>
     <w:qFormat/>
     <w:rsid w:val="00EC4E02"/>
@@ -956,7 +4253,6 @@
     <w:next w:val="Standard"/>
     <w:link w:val="berschrift4Zchn"/>
     <w:uiPriority w:val="9"/>
-    <w:semiHidden/>
     <w:unhideWhenUsed/>
     <w:qFormat/>
     <w:rsid w:val="00EC4E02"/>
@@ -1140,7 +4436,6 @@
     <w:basedOn w:val="Absatz-Standardschriftart"/>
     <w:link w:val="berschrift3"/>
     <w:uiPriority w:val="9"/>
-    <w:semiHidden/>
     <w:rsid w:val="00EC4E02"/>
     <w:rPr>
       <w:rFonts w:eastAsiaTheme="majorEastAsia" w:cstheme="majorBidi"/>
@@ -1154,7 +4449,6 @@
     <w:basedOn w:val="Absatz-Standardschriftart"/>
     <w:link w:val="berschrift4"/>
     <w:uiPriority w:val="9"/>
-    <w:semiHidden/>
     <w:rsid w:val="00EC4E02"/>
     <w:rPr>
       <w:rFonts w:eastAsiaTheme="majorEastAsia" w:cstheme="majorBidi"/>
@@ -1451,6 +4745,25 @@
     <w:link w:val="Fuzeile"/>
     <w:uiPriority w:val="99"/>
     <w:rsid w:val="00EC23DE"/>
+  </w:style>
+  <w:style w:type="paragraph" w:styleId="Beschriftung">
+    <w:name w:val="caption"/>
+    <w:basedOn w:val="Standard"/>
+    <w:next w:val="Standard"/>
+    <w:uiPriority w:val="35"/>
+    <w:unhideWhenUsed/>
+    <w:qFormat/>
+    <w:rsid w:val="00656D93"/>
+    <w:pPr>
+      <w:spacing w:after="200" w:line="240" w:lineRule="auto"/>
+    </w:pPr>
+    <w:rPr>
+      <w:i/>
+      <w:iCs/>
+      <w:color w:val="0E2841" w:themeColor="text2"/>
+      <w:sz w:val="18"/>
+      <w:szCs w:val="18"/>
+    </w:rPr>
   </w:style>
 </w:styles>
 </file>

</xml_diff>